<commit_message>
TS 2.2 2.3 Tamil kramam corrections
</commit_message>
<xml_diff>
--- a/TS-Kramam/TS-2.2/TS 2.2 Sanskrit Krama Paatam Corrections.docx
+++ b/TS-Kramam/TS-2.2/TS 2.2 Sanskrit Krama Paatam Corrections.docx
@@ -1,7 +1,710 @@
 
 <file path=word/document.xml><?xml version="1.0" encoding="utf-8"?>
-<w:document xmlns:wpc="http://schemas.microsoft.com/office/word/2010/wordprocessingCanvas" xmlns:cx="http://schemas.microsoft.com/office/drawing/2014/chartex" xmlns:cx1="http://schemas.microsoft.com/office/drawing/2015/9/8/chartex" xmlns:mc="http://schemas.openxmlformats.org/markup-compatibility/2006" xmlns:o="urn:schemas-microsoft-com:office:office" xmlns:r="http://schemas.openxmlformats.org/officeDocument/2006/relationships" xmlns:m="http://schemas.openxmlformats.org/officeDocument/2006/math" xmlns:v="urn:schemas-microsoft-com:vml" xmlns:wp14="http://schemas.microsoft.com/office/word/2010/wordprocessingDrawing" xmlns:wp="http://schemas.openxmlformats.org/drawingml/2006/wordprocessingDrawing" xmlns:w10="urn:schemas-microsoft-com:office:word" xmlns:w="http://schemas.openxmlformats.org/wordprocessingml/2006/main" xmlns:w14="http://schemas.microsoft.com/office/word/2010/wordml" xmlns:w15="http://schemas.microsoft.com/office/word/2012/wordml" xmlns:w16se="http://schemas.microsoft.com/office/word/2015/wordml/symex" xmlns:wpg="http://schemas.microsoft.com/office/word/2010/wordprocessingGroup" xmlns:wpi="http://schemas.microsoft.com/office/word/2010/wordprocessingInk" xmlns:wne="http://schemas.microsoft.com/office/word/2006/wordml" xmlns:wps="http://schemas.microsoft.com/office/word/2010/wordprocessingShape" mc:Ignorable="w14 w15 w16se wp14">
+<w:document xmlns:wpc="http://schemas.microsoft.com/office/word/2010/wordprocessingCanvas" xmlns:cx="http://schemas.microsoft.com/office/drawing/2014/chartex" xmlns:cx1="http://schemas.microsoft.com/office/drawing/2015/9/8/chartex" xmlns:cx2="http://schemas.microsoft.com/office/drawing/2015/10/21/chartex" xmlns:cx3="http://schemas.microsoft.com/office/drawing/2016/5/9/chartex" xmlns:cx4="http://schemas.microsoft.com/office/drawing/2016/5/10/chartex" xmlns:cx5="http://schemas.microsoft.com/office/drawing/2016/5/11/chartex" xmlns:cx6="http://schemas.microsoft.com/office/drawing/2016/5/12/chartex" xmlns:cx7="http://schemas.microsoft.com/office/drawing/2016/5/13/chartex" xmlns:cx8="http://schemas.microsoft.com/office/drawing/2016/5/14/chartex" xmlns:mc="http://schemas.openxmlformats.org/markup-compatibility/2006" xmlns:aink="http://schemas.microsoft.com/office/drawing/2016/ink" xmlns:am3d="http://schemas.microsoft.com/office/drawing/2017/model3d" xmlns:o="urn:schemas-microsoft-com:office:office" xmlns:oel="http://schemas.microsoft.com/office/2019/extlst" xmlns:r="http://schemas.openxmlformats.org/officeDocument/2006/relationships" xmlns:m="http://schemas.openxmlformats.org/officeDocument/2006/math" xmlns:v="urn:schemas-microsoft-com:vml" xmlns:wp14="http://schemas.microsoft.com/office/word/2010/wordprocessingDrawing" xmlns:wp="http://schemas.openxmlformats.org/drawingml/2006/wordprocessingDrawing" xmlns:w10="urn:schemas-microsoft-com:office:word" xmlns:w="http://schemas.openxmlformats.org/wordprocessingml/2006/main" xmlns:w14="http://schemas.microsoft.com/office/word/2010/wordml" xmlns:w15="http://schemas.microsoft.com/office/word/2012/wordml" xmlns:w16cex="http://schemas.microsoft.com/office/word/2018/wordml/cex" xmlns:w16cid="http://schemas.microsoft.com/office/word/2016/wordml/cid" xmlns:w16="http://schemas.microsoft.com/office/word/2018/wordml" xmlns:w16du="http://schemas.microsoft.com/office/word/2023/wordml/word16du" xmlns:w16sdtdh="http://schemas.microsoft.com/office/word/2020/wordml/sdtdatahash" xmlns:w16sdtfl="http://schemas.microsoft.com/office/word/2024/wordml/sdtformatlock" xmlns:w16se="http://schemas.microsoft.com/office/word/2015/wordml/symex" xmlns:wpg="http://schemas.microsoft.com/office/word/2010/wordprocessingGroup" xmlns:wpi="http://schemas.microsoft.com/office/word/2010/wordprocessingInk" xmlns:wne="http://schemas.microsoft.com/office/word/2006/wordml" xmlns:wps="http://schemas.microsoft.com/office/word/2010/wordprocessingShape" mc:Ignorable="w14 w15 w16se w16cid w16 w16cex w16sdtdh w16sdtfl w16du wp14">
   <w:body>
+    <w:p>
+      <w:pPr>
+        <w:jc w:val="center"/>
+        <w:rPr>
+          <w:b/>
+          <w:bCs/>
+        </w:rPr>
+      </w:pPr>
+      <w:r>
+        <w:rPr>
+          <w:b/>
+          <w:bCs/>
+          <w:sz w:val="32"/>
+          <w:szCs w:val="32"/>
+          <w:u w:val="single"/>
+        </w:rPr>
+        <w:t xml:space="preserve">TS </w:t>
+      </w:r>
+      <w:r>
+        <w:rPr>
+          <w:b/>
+          <w:bCs/>
+          <w:sz w:val="32"/>
+          <w:szCs w:val="32"/>
+          <w:u w:val="single"/>
+        </w:rPr>
+        <w:t>Krama</w:t>
+      </w:r>
+      <w:r>
+        <w:rPr>
+          <w:b/>
+          <w:bCs/>
+          <w:sz w:val="32"/>
+          <w:szCs w:val="32"/>
+          <w:u w:val="single"/>
+        </w:rPr>
+        <w:t xml:space="preserve"> Paatam – TS </w:t>
+      </w:r>
+      <w:r>
+        <w:rPr>
+          <w:b/>
+          <w:bCs/>
+          <w:sz w:val="32"/>
+          <w:szCs w:val="32"/>
+          <w:u w:val="single"/>
+        </w:rPr>
+        <w:t>2.2</w:t>
+      </w:r>
+      <w:r>
+        <w:rPr>
+          <w:b/>
+          <w:bCs/>
+          <w:sz w:val="32"/>
+          <w:szCs w:val="32"/>
+          <w:u w:val="single"/>
+        </w:rPr>
+        <w:t xml:space="preserve"> </w:t>
+      </w:r>
+      <w:r>
+        <w:rPr>
+          <w:b/>
+          <w:bCs/>
+          <w:sz w:val="32"/>
+          <w:szCs w:val="32"/>
+          <w:u w:val="single"/>
+        </w:rPr>
+        <w:t>Sanskrit</w:t>
+      </w:r>
+      <w:r>
+        <w:rPr>
+          <w:b/>
+          <w:bCs/>
+          <w:sz w:val="32"/>
+          <w:szCs w:val="32"/>
+          <w:u w:val="single"/>
+        </w:rPr>
+        <w:t xml:space="preserve"> </w:t>
+      </w:r>
+      <w:r>
+        <w:rPr>
+          <w:b/>
+          <w:bCs/>
+          <w:sz w:val="32"/>
+          <w:szCs w:val="32"/>
+          <w:u w:val="single"/>
+        </w:rPr>
+        <w:t>Corrections –</w:t>
+      </w:r>
+      <w:r>
+        <w:rPr>
+          <w:b/>
+          <w:bCs/>
+          <w:sz w:val="32"/>
+          <w:szCs w:val="32"/>
+          <w:u w:val="single"/>
+        </w:rPr>
+        <w:t xml:space="preserve"> </w:t>
+      </w:r>
+      <w:r>
+        <w:rPr>
+          <w:b/>
+          <w:bCs/>
+          <w:sz w:val="32"/>
+          <w:szCs w:val="32"/>
+          <w:u w:val="single"/>
+        </w:rPr>
+        <w:t xml:space="preserve">Observed till </w:t>
+      </w:r>
+      <w:proofErr w:type="spellStart"/>
+      <w:r>
+        <w:rPr>
+          <w:b/>
+          <w:bCs/>
+          <w:color w:val="EE0000"/>
+          <w:sz w:val="32"/>
+          <w:szCs w:val="32"/>
+          <w:highlight w:val="yellow"/>
+          <w:u w:val="single"/>
+        </w:rPr>
+        <w:t>xxxxxxx</w:t>
+      </w:r>
+      <w:proofErr w:type="spellEnd"/>
+      <w:r>
+        <w:rPr>
+          <w:b/>
+          <w:bCs/>
+        </w:rPr>
+        <w:t xml:space="preserve"> </w:t>
+      </w:r>
+      <w:r>
+        <w:rPr>
+          <w:b/>
+          <w:bCs/>
+        </w:rPr>
+        <w:br/>
+      </w:r>
+      <w:r>
+        <w:rPr>
+          <w:b/>
+          <w:bCs/>
+        </w:rPr>
+        <w:t>(ignore those which are already incorporated in your book’s version and date)</w:t>
+      </w:r>
+    </w:p>
+    <w:tbl>
+      <w:tblPr>
+        <w:tblW w:w="13638" w:type="dxa"/>
+        <w:tblInd w:w="108" w:type="dxa"/>
+        <w:tblBorders>
+          <w:top w:val="single" w:sz="4" w:space="0" w:color="000000"/>
+          <w:left w:val="single" w:sz="4" w:space="0" w:color="000000"/>
+          <w:bottom w:val="single" w:sz="4" w:space="0" w:color="000000"/>
+          <w:right w:val="single" w:sz="4" w:space="0" w:color="000000"/>
+          <w:insideH w:val="single" w:sz="4" w:space="0" w:color="000000"/>
+          <w:insideV w:val="single" w:sz="4" w:space="0" w:color="000000"/>
+        </w:tblBorders>
+        <w:tblLook w:val="04A0" w:firstRow="1" w:lastRow="0" w:firstColumn="1" w:lastColumn="0" w:noHBand="0" w:noVBand="1"/>
+      </w:tblPr>
+      <w:tblGrid>
+        <w:gridCol w:w="3715"/>
+        <w:gridCol w:w="5254"/>
+        <w:gridCol w:w="4669"/>
+      </w:tblGrid>
+      <w:tr>
+        <w:tc>
+          <w:tcPr>
+            <w:tcW w:w="3715" w:type="dxa"/>
+          </w:tcPr>
+          <w:p>
+            <w:pPr>
+              <w:spacing w:before="0" w:line="240" w:lineRule="auto"/>
+              <w:jc w:val="center"/>
+              <w:rPr>
+                <w:b/>
+                <w:bCs/>
+                <w:sz w:val="28"/>
+                <w:szCs w:val="28"/>
+              </w:rPr>
+            </w:pPr>
+            <w:r>
+              <w:rPr>
+                <w:b/>
+                <w:bCs/>
+                <w:sz w:val="28"/>
+                <w:szCs w:val="28"/>
+              </w:rPr>
+              <w:t>Section, Paragraph</w:t>
+            </w:r>
+          </w:p>
+          <w:p>
+            <w:pPr>
+              <w:spacing w:before="0" w:line="240" w:lineRule="auto"/>
+              <w:jc w:val="center"/>
+              <w:rPr>
+                <w:b/>
+                <w:bCs/>
+                <w:sz w:val="28"/>
+                <w:szCs w:val="28"/>
+              </w:rPr>
+            </w:pPr>
+            <w:r>
+              <w:rPr>
+                <w:b/>
+                <w:bCs/>
+                <w:sz w:val="28"/>
+                <w:szCs w:val="28"/>
+              </w:rPr>
+              <w:t>Reference</w:t>
+            </w:r>
+          </w:p>
+        </w:tc>
+        <w:tc>
+          <w:tcPr>
+            <w:tcW w:w="5254" w:type="dxa"/>
+          </w:tcPr>
+          <w:p>
+            <w:pPr>
+              <w:spacing w:before="0" w:line="240" w:lineRule="auto"/>
+              <w:jc w:val="center"/>
+              <w:rPr>
+                <w:b/>
+                <w:bCs/>
+                <w:sz w:val="28"/>
+                <w:szCs w:val="28"/>
+              </w:rPr>
+            </w:pPr>
+            <w:r>
+              <w:rPr>
+                <w:b/>
+                <w:bCs/>
+                <w:sz w:val="28"/>
+                <w:szCs w:val="28"/>
+              </w:rPr>
+              <w:t>As Printed</w:t>
+            </w:r>
+          </w:p>
+        </w:tc>
+        <w:tc>
+          <w:tcPr>
+            <w:tcW w:w="4669" w:type="dxa"/>
+          </w:tcPr>
+          <w:p>
+            <w:pPr>
+              <w:spacing w:before="0" w:line="240" w:lineRule="auto"/>
+              <w:ind w:right="-18"/>
+              <w:jc w:val="center"/>
+              <w:rPr>
+                <w:b/>
+                <w:bCs/>
+                <w:sz w:val="28"/>
+                <w:szCs w:val="28"/>
+              </w:rPr>
+            </w:pPr>
+            <w:r>
+              <w:rPr>
+                <w:b/>
+                <w:bCs/>
+                <w:sz w:val="28"/>
+                <w:szCs w:val="28"/>
+              </w:rPr>
+              <w:t>To be read as or corrected as</w:t>
+            </w:r>
+          </w:p>
+        </w:tc>
+      </w:tr>
+      <w:tr>
+        <w:trPr>
+          <w:trHeight w:val="1034"/>
+        </w:trPr>
+        <w:tc>
+          <w:tcPr>
+            <w:tcW w:w="3715" w:type="dxa"/>
+          </w:tcPr>
+          <w:p>
+            <w:pPr>
+              <w:widowControl w:val="0"/>
+              <w:autoSpaceDE w:val="0"/>
+              <w:autoSpaceDN w:val="0"/>
+              <w:adjustRightInd w:val="0"/>
+              <w:spacing w:before="0" w:line="240" w:lineRule="auto"/>
+              <w:rPr>
+                <w:rFonts w:cs="Arial"/>
+                <w:b/>
+                <w:sz w:val="28"/>
+                <w:szCs w:val="28"/>
+              </w:rPr>
+            </w:pPr>
+            <w:r>
+              <w:rPr>
+                <w:rFonts w:cs="Arial"/>
+                <w:b/>
+                <w:sz w:val="28"/>
+                <w:szCs w:val="28"/>
+              </w:rPr>
+              <w:t>TS 2.2.12.1</w:t>
+            </w:r>
+            <w:r>
+              <w:rPr>
+                <w:rFonts w:cs="Arial"/>
+                <w:b/>
+                <w:sz w:val="28"/>
+                <w:szCs w:val="28"/>
+              </w:rPr>
+              <w:t xml:space="preserve"> </w:t>
+            </w:r>
+            <w:r>
+              <w:rPr>
+                <w:rFonts w:cs="Arial"/>
+                <w:b/>
+                <w:sz w:val="28"/>
+                <w:szCs w:val="28"/>
+              </w:rPr>
+              <w:t>- Kramam</w:t>
+            </w:r>
+          </w:p>
+          <w:p>
+            <w:pPr>
+              <w:widowControl w:val="0"/>
+              <w:autoSpaceDE w:val="0"/>
+              <w:autoSpaceDN w:val="0"/>
+              <w:adjustRightInd w:val="0"/>
+              <w:spacing w:before="0" w:line="240" w:lineRule="auto"/>
+              <w:rPr>
+                <w:rFonts w:cs="Arial"/>
+                <w:b/>
+                <w:sz w:val="28"/>
+                <w:szCs w:val="28"/>
+              </w:rPr>
+            </w:pPr>
+            <w:r>
+              <w:rPr>
+                <w:rFonts w:cs="Arial"/>
+                <w:b/>
+                <w:sz w:val="28"/>
+                <w:szCs w:val="28"/>
+              </w:rPr>
+              <w:t xml:space="preserve">Krama </w:t>
+            </w:r>
+            <w:r>
+              <w:rPr>
+                <w:rFonts w:cs="Arial"/>
+                <w:b/>
+                <w:sz w:val="28"/>
+                <w:szCs w:val="28"/>
+              </w:rPr>
+              <w:t>Vaakyam</w:t>
+            </w:r>
+            <w:r>
+              <w:rPr>
+                <w:rFonts w:cs="Arial"/>
+                <w:b/>
+                <w:sz w:val="28"/>
+                <w:szCs w:val="28"/>
+              </w:rPr>
+              <w:t xml:space="preserve"> No. </w:t>
+            </w:r>
+            <w:r>
+              <w:rPr>
+                <w:rFonts w:cs="Arial"/>
+                <w:b/>
+                <w:sz w:val="28"/>
+                <w:szCs w:val="28"/>
+              </w:rPr>
+              <w:t>- 61</w:t>
+            </w:r>
+            <w:r>
+              <w:rPr>
+                <w:rFonts w:cs="Arial"/>
+                <w:b/>
+                <w:sz w:val="28"/>
+                <w:szCs w:val="28"/>
+              </w:rPr>
+              <w:br/>
+              <w:t xml:space="preserve">Panchaati </w:t>
+            </w:r>
+            <w:r>
+              <w:rPr>
+                <w:rFonts w:cs="Arial"/>
+                <w:b/>
+                <w:sz w:val="28"/>
+                <w:szCs w:val="28"/>
+              </w:rPr>
+              <w:t>No. - 64</w:t>
+            </w:r>
+          </w:p>
+        </w:tc>
+        <w:tc>
+          <w:tcPr>
+            <w:tcW w:w="5254" w:type="dxa"/>
+          </w:tcPr>
+          <w:p>
+            <w:pPr>
+              <w:widowControl w:val="0"/>
+              <w:autoSpaceDE w:val="0"/>
+              <w:autoSpaceDN w:val="0"/>
+              <w:adjustRightInd w:val="0"/>
+              <w:spacing w:line="252" w:lineRule="auto"/>
+              <w:ind w:right="-279"/>
+              <w:rPr>
+                <w:rFonts w:ascii="Latha" w:hAnsi="Latha" w:cs="Latha"/>
+                <w:sz w:val="28"/>
+                <w:szCs w:val="28"/>
+                <w:cs/>
+                <w:lang w:bidi="ta-IN"/>
+              </w:rPr>
+            </w:pPr>
+            <w:proofErr w:type="spellStart"/>
+            <w:r>
+              <w:rPr>
+                <w:rFonts w:ascii="BRH Devanagari Extra" w:hAnsi="BRH Devanagari Extra" w:cs="BRH Devanagari Extra"/>
+                <w:color w:val="000000"/>
+                <w:sz w:val="40"/>
+                <w:szCs w:val="40"/>
+              </w:rPr>
+              <w:t>zÉµÉ</w:t>
+            </w:r>
+            <w:r>
+              <w:rPr>
+                <w:rFonts w:ascii="BRH Devanagari Extra" w:hAnsi="BRH Devanagari Extra" w:cs="BRH Devanagari Extra"/>
+                <w:color w:val="000000"/>
+                <w:sz w:val="40"/>
+                <w:szCs w:val="40"/>
+                <w:highlight w:val="yellow"/>
+              </w:rPr>
+              <w:t>þiÉ</w:t>
+            </w:r>
+            <w:r>
+              <w:rPr>
+                <w:rFonts w:ascii="BRH Devanagari Extra" w:hAnsi="BRH Devanagari Extra" w:cs="BRH Devanagari Extra"/>
+                <w:color w:val="EE0000"/>
+                <w:sz w:val="40"/>
+                <w:szCs w:val="40"/>
+                <w:highlight w:val="yellow"/>
+              </w:rPr>
+              <w:t>È</w:t>
+            </w:r>
+            <w:proofErr w:type="spellEnd"/>
+            <w:r>
+              <w:rPr>
+                <w:rFonts w:ascii="BRH Devanagari Extra" w:hAnsi="BRH Devanagari Extra" w:cs="BRH Devanagari Extra"/>
+                <w:color w:val="000000"/>
+                <w:sz w:val="40"/>
+                <w:szCs w:val="40"/>
+                <w:highlight w:val="yellow"/>
+              </w:rPr>
+              <w:t xml:space="preserve"> </w:t>
+            </w:r>
+            <w:proofErr w:type="spellStart"/>
+            <w:r>
+              <w:rPr>
+                <w:rFonts w:ascii="BRH Devanagari Extra" w:hAnsi="BRH Devanagari Extra" w:cs="BRH Devanagari Extra"/>
+                <w:color w:val="000000"/>
+                <w:sz w:val="40"/>
+                <w:szCs w:val="40"/>
+                <w:highlight w:val="yellow"/>
+              </w:rPr>
+              <w:t>xMüÈ</w:t>
+            </w:r>
+            <w:proofErr w:type="spellEnd"/>
+            <w:r>
+              <w:rPr>
+                <w:rFonts w:ascii="BRH Devanagari Extra" w:hAnsi="BRH Devanagari Extra" w:cs="BRH Devanagari Extra"/>
+                <w:color w:val="000000"/>
+                <w:sz w:val="40"/>
+                <w:szCs w:val="40"/>
+              </w:rPr>
+              <w:t xml:space="preserve"> | Mü</w:t>
+            </w:r>
+            <w:r>
+              <w:rPr>
+                <w:rFonts w:ascii="BRH Malayalam Extra" w:hAnsi="BRH Malayalam Extra" w:cs="BRH Devanagari Extra"/>
+                <w:b/>
+                <w:color w:val="000000"/>
+                <w:sz w:val="32"/>
+                <w:szCs w:val="40"/>
+              </w:rPr>
+              <w:t>–</w:t>
+            </w:r>
+            <w:r>
+              <w:rPr>
+                <w:rFonts w:ascii="BRH Devanagari Extra" w:hAnsi="BRH Devanagari Extra" w:cs="BRH Devanagari Extra"/>
+                <w:color w:val="000000"/>
+                <w:sz w:val="40"/>
+                <w:szCs w:val="40"/>
+              </w:rPr>
+              <w:t>Uç</w:t>
+            </w:r>
+            <w:proofErr w:type="gramStart"/>
+            <w:r>
+              <w:rPr>
+                <w:rFonts w:ascii="BRH Malayalam Extra" w:hAnsi="BRH Malayalam Extra" w:cs="BRH Devanagari Extra"/>
+                <w:b/>
+                <w:color w:val="000000"/>
+                <w:sz w:val="32"/>
+                <w:szCs w:val="40"/>
+              </w:rPr>
+              <w:t>–</w:t>
+            </w:r>
+            <w:r>
+              <w:rPr>
+                <w:rFonts w:ascii="BRH Devanagari Extra" w:hAnsi="BRH Devanagari Extra" w:cs="BRH Devanagari Extra"/>
+                <w:color w:val="000000"/>
+                <w:sz w:val="40"/>
+                <w:szCs w:val="40"/>
+              </w:rPr>
+              <w:t>.</w:t>
+            </w:r>
+            <w:proofErr w:type="spellStart"/>
+            <w:r>
+              <w:rPr>
+                <w:rFonts w:ascii="BRH Devanagari Extra" w:hAnsi="BRH Devanagari Extra" w:cs="BRH Devanagari Extra"/>
+                <w:color w:val="000000"/>
+                <w:sz w:val="40"/>
+                <w:szCs w:val="40"/>
+              </w:rPr>
+              <w:t>WûxiÉåÿ</w:t>
+            </w:r>
+            <w:proofErr w:type="spellEnd"/>
+            <w:proofErr w:type="gramEnd"/>
+            <w:r>
+              <w:rPr>
+                <w:rFonts w:ascii="BRH Devanagari Extra" w:hAnsi="BRH Devanagari Extra" w:cs="BRH Devanagari Extra"/>
+                <w:color w:val="000000"/>
+                <w:sz w:val="40"/>
+                <w:szCs w:val="40"/>
+              </w:rPr>
+              <w:t xml:space="preserve"> |</w:t>
+            </w:r>
+          </w:p>
+        </w:tc>
+        <w:tc>
+          <w:tcPr>
+            <w:tcW w:w="4669" w:type="dxa"/>
+          </w:tcPr>
+          <w:p>
+            <w:pPr>
+              <w:widowControl w:val="0"/>
+              <w:autoSpaceDE w:val="0"/>
+              <w:autoSpaceDN w:val="0"/>
+              <w:adjustRightInd w:val="0"/>
+              <w:spacing w:line="252" w:lineRule="auto"/>
+              <w:ind w:right="-279"/>
+              <w:rPr>
+                <w:rFonts w:ascii="Latha" w:hAnsi="Latha" w:cs="Latha"/>
+                <w:sz w:val="28"/>
+                <w:szCs w:val="28"/>
+                <w:cs/>
+                <w:lang w:bidi="ta-IN"/>
+              </w:rPr>
+            </w:pPr>
+            <w:proofErr w:type="spellStart"/>
+            <w:r>
+              <w:rPr>
+                <w:rFonts w:ascii="BRH Devanagari Extra" w:hAnsi="BRH Devanagari Extra" w:cs="BRH Devanagari Extra"/>
+                <w:color w:val="000000"/>
+                <w:sz w:val="40"/>
+                <w:szCs w:val="40"/>
+              </w:rPr>
+              <w:t>zÉµÉ</w:t>
+            </w:r>
+            <w:r>
+              <w:rPr>
+                <w:rFonts w:ascii="BRH Devanagari Extra" w:hAnsi="BRH Devanagari Extra" w:cs="BRH Devanagari Extra"/>
+                <w:color w:val="000000"/>
+                <w:sz w:val="40"/>
+                <w:szCs w:val="40"/>
+                <w:highlight w:val="green"/>
+              </w:rPr>
+              <w:t>þiÉxMüÈ</w:t>
+            </w:r>
+            <w:proofErr w:type="spellEnd"/>
+            <w:r>
+              <w:rPr>
+                <w:rFonts w:ascii="BRH Devanagari Extra" w:hAnsi="BRH Devanagari Extra" w:cs="BRH Devanagari Extra"/>
+                <w:color w:val="000000"/>
+                <w:sz w:val="40"/>
+                <w:szCs w:val="40"/>
+              </w:rPr>
+              <w:t xml:space="preserve"> | Mü</w:t>
+            </w:r>
+            <w:r>
+              <w:rPr>
+                <w:rFonts w:ascii="BRH Malayalam Extra" w:hAnsi="BRH Malayalam Extra" w:cs="BRH Devanagari Extra"/>
+                <w:b/>
+                <w:color w:val="000000"/>
+                <w:sz w:val="32"/>
+                <w:szCs w:val="40"/>
+              </w:rPr>
+              <w:t>–</w:t>
+            </w:r>
+            <w:r>
+              <w:rPr>
+                <w:rFonts w:ascii="BRH Devanagari Extra" w:hAnsi="BRH Devanagari Extra" w:cs="BRH Devanagari Extra"/>
+                <w:color w:val="000000"/>
+                <w:sz w:val="40"/>
+                <w:szCs w:val="40"/>
+              </w:rPr>
+              <w:t>Uç</w:t>
+            </w:r>
+            <w:proofErr w:type="gramStart"/>
+            <w:r>
+              <w:rPr>
+                <w:rFonts w:ascii="BRH Malayalam Extra" w:hAnsi="BRH Malayalam Extra" w:cs="BRH Devanagari Extra"/>
+                <w:b/>
+                <w:color w:val="000000"/>
+                <w:sz w:val="32"/>
+                <w:szCs w:val="40"/>
+              </w:rPr>
+              <w:t>–</w:t>
+            </w:r>
+            <w:r>
+              <w:rPr>
+                <w:rFonts w:ascii="BRH Devanagari Extra" w:hAnsi="BRH Devanagari Extra" w:cs="BRH Devanagari Extra"/>
+                <w:color w:val="000000"/>
+                <w:sz w:val="40"/>
+                <w:szCs w:val="40"/>
+              </w:rPr>
+              <w:t>.</w:t>
+            </w:r>
+            <w:proofErr w:type="spellStart"/>
+            <w:r>
+              <w:rPr>
+                <w:rFonts w:ascii="BRH Devanagari Extra" w:hAnsi="BRH Devanagari Extra" w:cs="BRH Devanagari Extra"/>
+                <w:color w:val="000000"/>
+                <w:sz w:val="40"/>
+                <w:szCs w:val="40"/>
+              </w:rPr>
+              <w:t>WûxiÉåÿ</w:t>
+            </w:r>
+            <w:proofErr w:type="spellEnd"/>
+            <w:proofErr w:type="gramEnd"/>
+            <w:r>
+              <w:rPr>
+                <w:rFonts w:ascii="BRH Devanagari Extra" w:hAnsi="BRH Devanagari Extra" w:cs="BRH Devanagari Extra"/>
+                <w:color w:val="000000"/>
+                <w:sz w:val="40"/>
+                <w:szCs w:val="40"/>
+              </w:rPr>
+              <w:t xml:space="preserve"> |</w:t>
+            </w:r>
+            <w:r>
+              <w:rPr>
+                <w:rFonts w:ascii="Latha" w:hAnsi="Latha" w:cs="Latha"/>
+                <w:sz w:val="28"/>
+                <w:szCs w:val="28"/>
+                <w:lang w:bidi="ta-IN"/>
+              </w:rPr>
+              <w:t xml:space="preserve"> </w:t>
+            </w:r>
+            <w:r>
+              <w:rPr>
+                <w:rFonts w:ascii="Latha" w:hAnsi="Latha" w:cs="Latha"/>
+                <w:sz w:val="28"/>
+                <w:szCs w:val="28"/>
+                <w:lang w:bidi="ta-IN"/>
+              </w:rPr>
+              <w:br/>
+            </w:r>
+            <w:r>
+              <w:rPr>
+                <w:rFonts w:cs="Arial"/>
+                <w:sz w:val="28"/>
+                <w:szCs w:val="28"/>
+                <w:lang w:bidi="ta-IN"/>
+              </w:rPr>
+              <w:t xml:space="preserve">No </w:t>
+            </w:r>
+            <w:proofErr w:type="spellStart"/>
+            <w:r>
+              <w:rPr>
+                <w:rFonts w:cs="Arial"/>
+                <w:sz w:val="28"/>
+                <w:szCs w:val="28"/>
+                <w:lang w:bidi="ta-IN"/>
+              </w:rPr>
+              <w:t>visargam</w:t>
+            </w:r>
+            <w:proofErr w:type="spellEnd"/>
+            <w:r>
+              <w:rPr>
+                <w:rFonts w:cs="Arial"/>
+                <w:sz w:val="28"/>
+                <w:szCs w:val="28"/>
+                <w:lang w:bidi="ta-IN"/>
+              </w:rPr>
+              <w:br/>
+            </w:r>
+          </w:p>
+        </w:tc>
+      </w:tr>
+    </w:tbl>
+    <w:p>
+      <w:pPr>
+        <w:jc w:val="center"/>
+        <w:rPr>
+          <w:b/>
+          <w:bCs/>
+          <w:sz w:val="32"/>
+          <w:szCs w:val="32"/>
+          <w:u w:val="single"/>
+        </w:rPr>
+      </w:pPr>
+    </w:p>
     <w:p>
       <w:pPr>
         <w:jc w:val="center"/>
@@ -23,7 +726,6 @@
         </w:rPr>
         <w:t xml:space="preserve">TS </w:t>
       </w:r>
-      <w:proofErr w:type="spellStart"/>
       <w:r>
         <w:rPr>
           <w:b/>
@@ -34,7 +736,6 @@
         </w:rPr>
         <w:t>Krama</w:t>
       </w:r>
-      <w:proofErr w:type="spellEnd"/>
       <w:r>
         <w:rPr>
           <w:b/>
@@ -43,29 +744,7 @@
           <w:szCs w:val="32"/>
           <w:u w:val="single"/>
         </w:rPr>
-        <w:t xml:space="preserve"> </w:t>
-      </w:r>
-      <w:proofErr w:type="spellStart"/>
-      <w:r>
-        <w:rPr>
-          <w:b/>
-          <w:bCs/>
-          <w:sz w:val="32"/>
-          <w:szCs w:val="32"/>
-          <w:u w:val="single"/>
-        </w:rPr>
-        <w:t>Paatam</w:t>
-      </w:r>
-      <w:proofErr w:type="spellEnd"/>
-      <w:r>
-        <w:rPr>
-          <w:b/>
-          <w:bCs/>
-          <w:sz w:val="32"/>
-          <w:szCs w:val="32"/>
-          <w:u w:val="single"/>
-        </w:rPr>
-        <w:t xml:space="preserve"> – TS </w:t>
+        <w:t xml:space="preserve"> Paatam – TS </w:t>
       </w:r>
       <w:r>
         <w:rPr>
@@ -322,19 +1001,8 @@
                 <w:sz w:val="28"/>
                 <w:szCs w:val="28"/>
               </w:rPr>
-              <w:t xml:space="preserve">- </w:t>
-            </w:r>
-            <w:proofErr w:type="spellStart"/>
-            <w:r>
-              <w:rPr>
-                <w:rFonts w:cs="Arial"/>
-                <w:b/>
-                <w:sz w:val="28"/>
-                <w:szCs w:val="28"/>
-              </w:rPr>
-              <w:t>Kramam</w:t>
-            </w:r>
-            <w:proofErr w:type="spellEnd"/>
+              <w:t>- Kramam</w:t>
+            </w:r>
           </w:p>
           <w:p>
             <w:pPr>
@@ -350,27 +1018,15 @@
                 <w:szCs w:val="28"/>
               </w:rPr>
             </w:pPr>
-            <w:proofErr w:type="spellStart"/>
-            <w:r>
-              <w:rPr>
-                <w:rFonts w:cs="Arial"/>
-                <w:b/>
-                <w:sz w:val="28"/>
-                <w:szCs w:val="28"/>
-              </w:rPr>
-              <w:t>Krama</w:t>
-            </w:r>
-            <w:proofErr w:type="spellEnd"/>
-            <w:r>
-              <w:rPr>
-                <w:rFonts w:cs="Arial"/>
-                <w:b/>
-                <w:sz w:val="28"/>
-                <w:szCs w:val="28"/>
-              </w:rPr>
-              <w:t xml:space="preserve"> </w:t>
-            </w:r>
-            <w:proofErr w:type="spellStart"/>
+            <w:r>
+              <w:rPr>
+                <w:rFonts w:cs="Arial"/>
+                <w:b/>
+                <w:sz w:val="28"/>
+                <w:szCs w:val="28"/>
+              </w:rPr>
+              <w:t xml:space="preserve">Krama </w:t>
+            </w:r>
             <w:r>
               <w:rPr>
                 <w:rFonts w:cs="Arial"/>
@@ -380,7 +1036,6 @@
               </w:rPr>
               <w:t>Vaakyam</w:t>
             </w:r>
-            <w:proofErr w:type="spellEnd"/>
             <w:r>
               <w:rPr>
                 <w:rFonts w:cs="Arial"/>
@@ -407,26 +1062,7 @@
                 <w:szCs w:val="28"/>
               </w:rPr>
               <w:br/>
-            </w:r>
-            <w:proofErr w:type="spellStart"/>
-            <w:r>
-              <w:rPr>
-                <w:rFonts w:cs="Arial"/>
-                <w:b/>
-                <w:sz w:val="28"/>
-                <w:szCs w:val="28"/>
-              </w:rPr>
-              <w:t>Panchaati</w:t>
-            </w:r>
-            <w:proofErr w:type="spellEnd"/>
-            <w:r>
-              <w:rPr>
-                <w:rFonts w:cs="Arial"/>
-                <w:b/>
-                <w:sz w:val="28"/>
-                <w:szCs w:val="28"/>
-              </w:rPr>
-              <w:t xml:space="preserve"> </w:t>
+              <w:t xml:space="preserve">Panchaati </w:t>
             </w:r>
             <w:r>
               <w:rPr>
@@ -851,19 +1487,8 @@
                 <w:sz w:val="28"/>
                 <w:szCs w:val="28"/>
               </w:rPr>
-              <w:t xml:space="preserve">- </w:t>
-            </w:r>
-            <w:proofErr w:type="spellStart"/>
-            <w:r>
-              <w:rPr>
-                <w:rFonts w:cs="Arial"/>
-                <w:b/>
-                <w:sz w:val="28"/>
-                <w:szCs w:val="28"/>
-              </w:rPr>
-              <w:t>Kramam</w:t>
-            </w:r>
-            <w:proofErr w:type="spellEnd"/>
+              <w:t>- Kramam</w:t>
+            </w:r>
           </w:p>
           <w:p>
             <w:pPr>
@@ -879,27 +1504,15 @@
                 <w:szCs w:val="28"/>
               </w:rPr>
             </w:pPr>
-            <w:proofErr w:type="spellStart"/>
-            <w:r>
-              <w:rPr>
-                <w:rFonts w:cs="Arial"/>
-                <w:b/>
-                <w:sz w:val="28"/>
-                <w:szCs w:val="28"/>
-              </w:rPr>
-              <w:t>Krama</w:t>
-            </w:r>
-            <w:proofErr w:type="spellEnd"/>
-            <w:r>
-              <w:rPr>
-                <w:rFonts w:cs="Arial"/>
-                <w:b/>
-                <w:sz w:val="28"/>
-                <w:szCs w:val="28"/>
-              </w:rPr>
-              <w:t xml:space="preserve"> </w:t>
-            </w:r>
-            <w:proofErr w:type="spellStart"/>
+            <w:r>
+              <w:rPr>
+                <w:rFonts w:cs="Arial"/>
+                <w:b/>
+                <w:sz w:val="28"/>
+                <w:szCs w:val="28"/>
+              </w:rPr>
+              <w:t xml:space="preserve">Krama </w:t>
+            </w:r>
             <w:r>
               <w:rPr>
                 <w:rFonts w:cs="Arial"/>
@@ -909,7 +1522,6 @@
               </w:rPr>
               <w:t>Vaakyam</w:t>
             </w:r>
-            <w:proofErr w:type="spellEnd"/>
             <w:r>
               <w:rPr>
                 <w:rFonts w:cs="Arial"/>
@@ -936,26 +1548,7 @@
                 <w:szCs w:val="28"/>
               </w:rPr>
               <w:br/>
-            </w:r>
-            <w:proofErr w:type="spellStart"/>
-            <w:r>
-              <w:rPr>
-                <w:rFonts w:cs="Arial"/>
-                <w:b/>
-                <w:sz w:val="28"/>
-                <w:szCs w:val="28"/>
-              </w:rPr>
-              <w:t>Panchaati</w:t>
-            </w:r>
-            <w:proofErr w:type="spellEnd"/>
-            <w:r>
-              <w:rPr>
-                <w:rFonts w:cs="Arial"/>
-                <w:b/>
-                <w:sz w:val="28"/>
-                <w:szCs w:val="28"/>
-              </w:rPr>
-              <w:t xml:space="preserve"> </w:t>
+              <w:t xml:space="preserve">Panchaati </w:t>
             </w:r>
             <w:r>
               <w:rPr>
@@ -1014,7 +1607,6 @@
               </w:rPr>
               <w:t>–</w:t>
             </w:r>
-            <w:proofErr w:type="spellStart"/>
             <w:r>
               <w:rPr>
                 <w:rFonts w:ascii="BRH Devanagari Extra" w:hAnsi="BRH Devanagari Extra" w:cs="BRH Devanagari Extra"/>
@@ -1024,7 +1616,6 @@
               </w:rPr>
               <w:t>aÉ</w:t>
             </w:r>
-            <w:proofErr w:type="spellEnd"/>
             <w:r>
               <w:rPr>
                 <w:rFonts w:ascii="BRH Malayalam Extra" w:hAnsi="BRH Malayalam Extra" w:cs="BRH Devanagari Extra"/>
@@ -1170,7 +1761,6 @@
               </w:rPr>
               <w:t>–</w:t>
             </w:r>
-            <w:proofErr w:type="spellStart"/>
             <w:r>
               <w:rPr>
                 <w:rFonts w:ascii="BRH Devanagari Extra" w:hAnsi="BRH Devanagari Extra" w:cs="BRH Devanagari Extra"/>
@@ -1180,7 +1770,6 @@
               </w:rPr>
               <w:t>aÉ</w:t>
             </w:r>
-            <w:proofErr w:type="spellEnd"/>
             <w:r>
               <w:rPr>
                 <w:rFonts w:ascii="BRH Malayalam Extra" w:hAnsi="BRH Malayalam Extra" w:cs="BRH Devanagari Extra"/>
@@ -1320,6 +1909,7 @@
                 <w:sz w:val="28"/>
                 <w:szCs w:val="28"/>
               </w:rPr>
+              <w:lastRenderedPageBreak/>
               <w:t>TS 2.2.5.3</w:t>
             </w:r>
             <w:r>
@@ -1338,19 +1928,8 @@
                 <w:sz w:val="28"/>
                 <w:szCs w:val="28"/>
               </w:rPr>
-              <w:t xml:space="preserve">- </w:t>
-            </w:r>
-            <w:proofErr w:type="spellStart"/>
-            <w:r>
-              <w:rPr>
-                <w:rFonts w:cs="Arial"/>
-                <w:b/>
-                <w:sz w:val="28"/>
-                <w:szCs w:val="28"/>
-              </w:rPr>
-              <w:t>Kramam</w:t>
-            </w:r>
-            <w:proofErr w:type="spellEnd"/>
+              <w:t>- Kramam</w:t>
+            </w:r>
           </w:p>
           <w:p>
             <w:pPr>
@@ -1366,27 +1945,15 @@
                 <w:szCs w:val="28"/>
               </w:rPr>
             </w:pPr>
-            <w:proofErr w:type="spellStart"/>
-            <w:r>
-              <w:rPr>
-                <w:rFonts w:cs="Arial"/>
-                <w:b/>
-                <w:sz w:val="28"/>
-                <w:szCs w:val="28"/>
-              </w:rPr>
-              <w:t>Krama</w:t>
-            </w:r>
-            <w:proofErr w:type="spellEnd"/>
-            <w:r>
-              <w:rPr>
-                <w:rFonts w:cs="Arial"/>
-                <w:b/>
-                <w:sz w:val="28"/>
-                <w:szCs w:val="28"/>
-              </w:rPr>
-              <w:t xml:space="preserve"> </w:t>
-            </w:r>
-            <w:proofErr w:type="spellStart"/>
+            <w:r>
+              <w:rPr>
+                <w:rFonts w:cs="Arial"/>
+                <w:b/>
+                <w:sz w:val="28"/>
+                <w:szCs w:val="28"/>
+              </w:rPr>
+              <w:t xml:space="preserve">Krama </w:t>
+            </w:r>
             <w:r>
               <w:rPr>
                 <w:rFonts w:cs="Arial"/>
@@ -1396,7 +1963,6 @@
               </w:rPr>
               <w:t>Vaakyam</w:t>
             </w:r>
-            <w:proofErr w:type="spellEnd"/>
             <w:r>
               <w:rPr>
                 <w:rFonts w:cs="Arial"/>
@@ -1423,26 +1989,7 @@
                 <w:szCs w:val="28"/>
               </w:rPr>
               <w:br/>
-            </w:r>
-            <w:proofErr w:type="spellStart"/>
-            <w:r>
-              <w:rPr>
-                <w:rFonts w:cs="Arial"/>
-                <w:b/>
-                <w:sz w:val="28"/>
-                <w:szCs w:val="28"/>
-              </w:rPr>
-              <w:t>Panchaati</w:t>
-            </w:r>
-            <w:proofErr w:type="spellEnd"/>
-            <w:r>
-              <w:rPr>
-                <w:rFonts w:cs="Arial"/>
-                <w:b/>
-                <w:sz w:val="28"/>
-                <w:szCs w:val="28"/>
-              </w:rPr>
-              <w:t xml:space="preserve"> </w:t>
+              <w:t xml:space="preserve">Panchaati </w:t>
             </w:r>
             <w:r>
               <w:rPr>
@@ -1731,19 +2278,8 @@
                 <w:sz w:val="28"/>
                 <w:szCs w:val="28"/>
               </w:rPr>
-              <w:t xml:space="preserve">- </w:t>
-            </w:r>
-            <w:proofErr w:type="spellStart"/>
-            <w:r>
-              <w:rPr>
-                <w:rFonts w:cs="Arial"/>
-                <w:b/>
-                <w:sz w:val="28"/>
-                <w:szCs w:val="28"/>
-              </w:rPr>
-              <w:t>Kramam</w:t>
-            </w:r>
-            <w:proofErr w:type="spellEnd"/>
+              <w:t>- Kramam</w:t>
+            </w:r>
           </w:p>
           <w:p>
             <w:pPr>
@@ -1759,27 +2295,15 @@
                 <w:szCs w:val="28"/>
               </w:rPr>
             </w:pPr>
-            <w:proofErr w:type="spellStart"/>
-            <w:r>
-              <w:rPr>
-                <w:rFonts w:cs="Arial"/>
-                <w:b/>
-                <w:sz w:val="28"/>
-                <w:szCs w:val="28"/>
-              </w:rPr>
-              <w:t>Krama</w:t>
-            </w:r>
-            <w:proofErr w:type="spellEnd"/>
-            <w:r>
-              <w:rPr>
-                <w:rFonts w:cs="Arial"/>
-                <w:b/>
-                <w:sz w:val="28"/>
-                <w:szCs w:val="28"/>
-              </w:rPr>
-              <w:t xml:space="preserve"> </w:t>
-            </w:r>
-            <w:proofErr w:type="spellStart"/>
+            <w:r>
+              <w:rPr>
+                <w:rFonts w:cs="Arial"/>
+                <w:b/>
+                <w:sz w:val="28"/>
+                <w:szCs w:val="28"/>
+              </w:rPr>
+              <w:t xml:space="preserve">Krama </w:t>
+            </w:r>
             <w:r>
               <w:rPr>
                 <w:rFonts w:cs="Arial"/>
@@ -1789,7 +2313,6 @@
               </w:rPr>
               <w:t>Vaakyam</w:t>
             </w:r>
-            <w:proofErr w:type="spellEnd"/>
             <w:r>
               <w:rPr>
                 <w:rFonts w:cs="Arial"/>
@@ -1816,26 +2339,7 @@
                 <w:szCs w:val="28"/>
               </w:rPr>
               <w:br/>
-            </w:r>
-            <w:proofErr w:type="spellStart"/>
-            <w:r>
-              <w:rPr>
-                <w:rFonts w:cs="Arial"/>
-                <w:b/>
-                <w:sz w:val="28"/>
-                <w:szCs w:val="28"/>
-              </w:rPr>
-              <w:t>Panchaati</w:t>
-            </w:r>
-            <w:proofErr w:type="spellEnd"/>
-            <w:r>
-              <w:rPr>
-                <w:rFonts w:cs="Arial"/>
-                <w:b/>
-                <w:sz w:val="28"/>
-                <w:szCs w:val="28"/>
-              </w:rPr>
-              <w:t xml:space="preserve"> </w:t>
+              <w:t xml:space="preserve">Panchaati </w:t>
             </w:r>
             <w:r>
               <w:rPr>
@@ -2147,19 +2651,8 @@
                 <w:sz w:val="28"/>
                 <w:szCs w:val="28"/>
               </w:rPr>
-              <w:t xml:space="preserve">- </w:t>
-            </w:r>
-            <w:proofErr w:type="spellStart"/>
-            <w:r>
-              <w:rPr>
-                <w:rFonts w:cs="Arial"/>
-                <w:b/>
-                <w:sz w:val="28"/>
-                <w:szCs w:val="28"/>
-              </w:rPr>
-              <w:t>Kramam</w:t>
-            </w:r>
-            <w:proofErr w:type="spellEnd"/>
+              <w:t>- Kramam</w:t>
+            </w:r>
           </w:p>
           <w:p>
             <w:pPr>
@@ -2175,27 +2668,15 @@
                 <w:szCs w:val="28"/>
               </w:rPr>
             </w:pPr>
-            <w:proofErr w:type="spellStart"/>
-            <w:r>
-              <w:rPr>
-                <w:rFonts w:cs="Arial"/>
-                <w:b/>
-                <w:sz w:val="28"/>
-                <w:szCs w:val="28"/>
-              </w:rPr>
-              <w:t>Krama</w:t>
-            </w:r>
-            <w:proofErr w:type="spellEnd"/>
-            <w:r>
-              <w:rPr>
-                <w:rFonts w:cs="Arial"/>
-                <w:b/>
-                <w:sz w:val="28"/>
-                <w:szCs w:val="28"/>
-              </w:rPr>
-              <w:t xml:space="preserve"> </w:t>
-            </w:r>
-            <w:proofErr w:type="spellStart"/>
+            <w:r>
+              <w:rPr>
+                <w:rFonts w:cs="Arial"/>
+                <w:b/>
+                <w:sz w:val="28"/>
+                <w:szCs w:val="28"/>
+              </w:rPr>
+              <w:t xml:space="preserve">Krama </w:t>
+            </w:r>
             <w:r>
               <w:rPr>
                 <w:rFonts w:cs="Arial"/>
@@ -2205,7 +2686,6 @@
               </w:rPr>
               <w:t>Vaakyam</w:t>
             </w:r>
-            <w:proofErr w:type="spellEnd"/>
             <w:r>
               <w:rPr>
                 <w:rFonts w:cs="Arial"/>
@@ -2232,26 +2712,7 @@
                 <w:szCs w:val="28"/>
               </w:rPr>
               <w:br/>
-            </w:r>
-            <w:proofErr w:type="spellStart"/>
-            <w:r>
-              <w:rPr>
-                <w:rFonts w:cs="Arial"/>
-                <w:b/>
-                <w:sz w:val="28"/>
-                <w:szCs w:val="28"/>
-              </w:rPr>
-              <w:t>Panchaati</w:t>
-            </w:r>
-            <w:proofErr w:type="spellEnd"/>
-            <w:r>
-              <w:rPr>
-                <w:rFonts w:cs="Arial"/>
-                <w:b/>
-                <w:sz w:val="28"/>
-                <w:szCs w:val="28"/>
-              </w:rPr>
-              <w:t xml:space="preserve"> </w:t>
+              <w:t xml:space="preserve">Panchaati </w:t>
             </w:r>
             <w:r>
               <w:rPr>
@@ -2616,7 +3077,6 @@
                 <w:sz w:val="28"/>
                 <w:szCs w:val="28"/>
               </w:rPr>
-              <w:lastRenderedPageBreak/>
               <w:t>TS 2.2.6.5</w:t>
             </w:r>
             <w:r>
@@ -2635,19 +3095,8 @@
                 <w:sz w:val="28"/>
                 <w:szCs w:val="28"/>
               </w:rPr>
-              <w:t xml:space="preserve">- </w:t>
-            </w:r>
-            <w:proofErr w:type="spellStart"/>
-            <w:r>
-              <w:rPr>
-                <w:rFonts w:cs="Arial"/>
-                <w:b/>
-                <w:sz w:val="28"/>
-                <w:szCs w:val="28"/>
-              </w:rPr>
-              <w:t>Kramam</w:t>
-            </w:r>
-            <w:proofErr w:type="spellEnd"/>
+              <w:t>- Kramam</w:t>
+            </w:r>
           </w:p>
           <w:p>
             <w:pPr>
@@ -2663,27 +3112,15 @@
                 <w:szCs w:val="28"/>
               </w:rPr>
             </w:pPr>
-            <w:proofErr w:type="spellStart"/>
-            <w:r>
-              <w:rPr>
-                <w:rFonts w:cs="Arial"/>
-                <w:b/>
-                <w:sz w:val="28"/>
-                <w:szCs w:val="28"/>
-              </w:rPr>
-              <w:t>Krama</w:t>
-            </w:r>
-            <w:proofErr w:type="spellEnd"/>
-            <w:r>
-              <w:rPr>
-                <w:rFonts w:cs="Arial"/>
-                <w:b/>
-                <w:sz w:val="28"/>
-                <w:szCs w:val="28"/>
-              </w:rPr>
-              <w:t xml:space="preserve"> </w:t>
-            </w:r>
-            <w:proofErr w:type="spellStart"/>
+            <w:r>
+              <w:rPr>
+                <w:rFonts w:cs="Arial"/>
+                <w:b/>
+                <w:sz w:val="28"/>
+                <w:szCs w:val="28"/>
+              </w:rPr>
+              <w:t xml:space="preserve">Krama </w:t>
+            </w:r>
             <w:r>
               <w:rPr>
                 <w:rFonts w:cs="Arial"/>
@@ -2693,7 +3130,6 @@
               </w:rPr>
               <w:t>Vaakyam</w:t>
             </w:r>
-            <w:proofErr w:type="spellEnd"/>
             <w:r>
               <w:rPr>
                 <w:rFonts w:cs="Arial"/>
@@ -2720,26 +3156,7 @@
                 <w:szCs w:val="28"/>
               </w:rPr>
               <w:br/>
-            </w:r>
-            <w:proofErr w:type="spellStart"/>
-            <w:r>
-              <w:rPr>
-                <w:rFonts w:cs="Arial"/>
-                <w:b/>
-                <w:sz w:val="28"/>
-                <w:szCs w:val="28"/>
-              </w:rPr>
-              <w:t>Panchaati</w:t>
-            </w:r>
-            <w:proofErr w:type="spellEnd"/>
-            <w:r>
-              <w:rPr>
-                <w:rFonts w:cs="Arial"/>
-                <w:b/>
-                <w:sz w:val="28"/>
-                <w:szCs w:val="28"/>
-              </w:rPr>
-              <w:t xml:space="preserve"> </w:t>
+              <w:t xml:space="preserve">Panchaati </w:t>
             </w:r>
             <w:r>
               <w:rPr>
@@ -2793,7 +3210,6 @@
               </w:rPr>
               <w:t>–</w:t>
             </w:r>
-            <w:proofErr w:type="spellStart"/>
             <w:r>
               <w:rPr>
                 <w:rFonts w:ascii="BRH Devanagari Extra" w:hAnsi="BRH Devanagari Extra" w:cs="BRH Devanagari Extra"/>
@@ -2804,7 +3220,6 @@
               </w:rPr>
               <w:t>mÉ</w:t>
             </w:r>
-            <w:proofErr w:type="spellEnd"/>
             <w:r>
               <w:rPr>
                 <w:rFonts w:ascii="BRH Malayalam Extra" w:hAnsi="BRH Malayalam Extra" w:cs="BRH Devanagari Extra"/>
@@ -2855,25 +3270,14 @@
               </w:rPr>
               <w:t>–</w:t>
             </w:r>
-            <w:proofErr w:type="spellStart"/>
-            <w:r>
-              <w:rPr>
-                <w:rFonts w:ascii="BRH Devanagari Extra" w:hAnsi="BRH Devanagari Extra" w:cs="BRH Devanagari Extra"/>
-                <w:color w:val="000000"/>
-                <w:sz w:val="40"/>
-                <w:szCs w:val="40"/>
-              </w:rPr>
-              <w:t>lÉ</w:t>
-            </w:r>
-            <w:proofErr w:type="spellEnd"/>
-            <w:r>
-              <w:rPr>
-                <w:rFonts w:ascii="BRH Devanagari Extra" w:hAnsi="BRH Devanagari Extra" w:cs="BRH Devanagari Extra"/>
-                <w:color w:val="000000"/>
-                <w:sz w:val="40"/>
-                <w:szCs w:val="40"/>
-              </w:rPr>
-              <w:t xml:space="preserve"> </w:t>
+            <w:r>
+              <w:rPr>
+                <w:rFonts w:ascii="BRH Devanagari Extra" w:hAnsi="BRH Devanagari Extra" w:cs="BRH Devanagari Extra"/>
+                <w:color w:val="000000"/>
+                <w:sz w:val="40"/>
+                <w:szCs w:val="40"/>
+              </w:rPr>
+              <w:t xml:space="preserve">lÉ </w:t>
             </w:r>
             <w:proofErr w:type="spellStart"/>
             <w:r>
@@ -2979,7 +3383,6 @@
               </w:rPr>
               <w:t>–</w:t>
             </w:r>
-            <w:proofErr w:type="spellStart"/>
             <w:r>
               <w:rPr>
                 <w:rFonts w:ascii="BRH Devanagari Extra" w:hAnsi="BRH Devanagari Extra" w:cs="BRH Devanagari Extra"/>
@@ -2990,7 +3393,6 @@
               </w:rPr>
               <w:t>mÉ</w:t>
             </w:r>
-            <w:proofErr w:type="spellEnd"/>
             <w:r>
               <w:rPr>
                 <w:rFonts w:ascii="BRH Malayalam Extra" w:hAnsi="BRH Malayalam Extra" w:cs="BRH Devanagari Extra"/>
@@ -3041,25 +3443,14 @@
               </w:rPr>
               <w:t>–</w:t>
             </w:r>
-            <w:proofErr w:type="spellStart"/>
-            <w:r>
-              <w:rPr>
-                <w:rFonts w:ascii="BRH Devanagari Extra" w:hAnsi="BRH Devanagari Extra" w:cs="BRH Devanagari Extra"/>
-                <w:color w:val="000000"/>
-                <w:sz w:val="40"/>
-                <w:szCs w:val="40"/>
-              </w:rPr>
-              <w:t>lÉ</w:t>
-            </w:r>
-            <w:proofErr w:type="spellEnd"/>
-            <w:r>
-              <w:rPr>
-                <w:rFonts w:ascii="BRH Devanagari Extra" w:hAnsi="BRH Devanagari Extra" w:cs="BRH Devanagari Extra"/>
-                <w:color w:val="000000"/>
-                <w:sz w:val="40"/>
-                <w:szCs w:val="40"/>
-              </w:rPr>
-              <w:t xml:space="preserve"> </w:t>
+            <w:r>
+              <w:rPr>
+                <w:rFonts w:ascii="BRH Devanagari Extra" w:hAnsi="BRH Devanagari Extra" w:cs="BRH Devanagari Extra"/>
+                <w:color w:val="000000"/>
+                <w:sz w:val="40"/>
+                <w:szCs w:val="40"/>
+              </w:rPr>
+              <w:t xml:space="preserve">lÉ </w:t>
             </w:r>
             <w:proofErr w:type="spellStart"/>
             <w:r>
@@ -3178,19 +3569,8 @@
                 <w:sz w:val="28"/>
                 <w:szCs w:val="28"/>
               </w:rPr>
-              <w:t xml:space="preserve">- </w:t>
-            </w:r>
-            <w:proofErr w:type="spellStart"/>
-            <w:r>
-              <w:rPr>
-                <w:rFonts w:cs="Arial"/>
-                <w:b/>
-                <w:sz w:val="28"/>
-                <w:szCs w:val="28"/>
-              </w:rPr>
-              <w:t>Kramam</w:t>
-            </w:r>
-            <w:proofErr w:type="spellEnd"/>
+              <w:t>- Kramam</w:t>
+            </w:r>
           </w:p>
           <w:p>
             <w:pPr>
@@ -3206,27 +3586,15 @@
                 <w:szCs w:val="28"/>
               </w:rPr>
             </w:pPr>
-            <w:proofErr w:type="spellStart"/>
-            <w:r>
-              <w:rPr>
-                <w:rFonts w:cs="Arial"/>
-                <w:b/>
-                <w:sz w:val="28"/>
-                <w:szCs w:val="28"/>
-              </w:rPr>
-              <w:t>Krama</w:t>
-            </w:r>
-            <w:proofErr w:type="spellEnd"/>
-            <w:r>
-              <w:rPr>
-                <w:rFonts w:cs="Arial"/>
-                <w:b/>
-                <w:sz w:val="28"/>
-                <w:szCs w:val="28"/>
-              </w:rPr>
-              <w:t xml:space="preserve"> </w:t>
-            </w:r>
-            <w:proofErr w:type="spellStart"/>
+            <w:r>
+              <w:rPr>
+                <w:rFonts w:cs="Arial"/>
+                <w:b/>
+                <w:sz w:val="28"/>
+                <w:szCs w:val="28"/>
+              </w:rPr>
+              <w:t xml:space="preserve">Krama </w:t>
+            </w:r>
             <w:r>
               <w:rPr>
                 <w:rFonts w:cs="Arial"/>
@@ -3236,7 +3604,6 @@
               </w:rPr>
               <w:t>Vaakyam</w:t>
             </w:r>
-            <w:proofErr w:type="spellEnd"/>
             <w:r>
               <w:rPr>
                 <w:rFonts w:cs="Arial"/>
@@ -3263,26 +3630,7 @@
                 <w:szCs w:val="28"/>
               </w:rPr>
               <w:br/>
-            </w:r>
-            <w:proofErr w:type="spellStart"/>
-            <w:r>
-              <w:rPr>
-                <w:rFonts w:cs="Arial"/>
-                <w:b/>
-                <w:sz w:val="28"/>
-                <w:szCs w:val="28"/>
-              </w:rPr>
-              <w:t>Panchaati</w:t>
-            </w:r>
-            <w:proofErr w:type="spellEnd"/>
-            <w:r>
-              <w:rPr>
-                <w:rFonts w:cs="Arial"/>
-                <w:b/>
-                <w:sz w:val="28"/>
-                <w:szCs w:val="28"/>
-              </w:rPr>
-              <w:t xml:space="preserve"> </w:t>
+              <w:t xml:space="preserve">Panchaati </w:t>
             </w:r>
             <w:r>
               <w:rPr>
@@ -3339,7 +3687,6 @@
               </w:rPr>
               <w:t>–</w:t>
             </w:r>
-            <w:proofErr w:type="spellStart"/>
             <w:r>
               <w:rPr>
                 <w:rFonts w:ascii="BRH Devanagari Extra" w:hAnsi="BRH Devanagari Extra" w:cs="BRH Devanagari Extra"/>
@@ -3349,7 +3696,6 @@
               </w:rPr>
               <w:t>óè</w:t>
             </w:r>
-            <w:proofErr w:type="spellEnd"/>
             <w:r>
               <w:rPr>
                 <w:rFonts w:ascii="BRH Malayalam Extra" w:hAnsi="BRH Malayalam Extra" w:cs="BRH Devanagari Extra"/>
@@ -3534,7 +3880,6 @@
               </w:rPr>
               <w:t>–</w:t>
             </w:r>
-            <w:proofErr w:type="spellStart"/>
             <w:r>
               <w:rPr>
                 <w:rFonts w:ascii="BRH Devanagari Extra" w:hAnsi="BRH Devanagari Extra" w:cs="BRH Devanagari Extra"/>
@@ -3544,7 +3889,6 @@
               </w:rPr>
               <w:t>óè</w:t>
             </w:r>
-            <w:proofErr w:type="spellEnd"/>
             <w:r>
               <w:rPr>
                 <w:rFonts w:ascii="BRH Malayalam Extra" w:hAnsi="BRH Malayalam Extra" w:cs="BRH Devanagari Extra"/>
@@ -3730,19 +4074,8 @@
                 <w:sz w:val="28"/>
                 <w:szCs w:val="28"/>
               </w:rPr>
-              <w:t xml:space="preserve">- </w:t>
-            </w:r>
-            <w:proofErr w:type="spellStart"/>
-            <w:r>
-              <w:rPr>
-                <w:rFonts w:cs="Arial"/>
-                <w:b/>
-                <w:sz w:val="28"/>
-                <w:szCs w:val="28"/>
-              </w:rPr>
-              <w:t>Kramam</w:t>
-            </w:r>
-            <w:proofErr w:type="spellEnd"/>
+              <w:t>- Kramam</w:t>
+            </w:r>
           </w:p>
           <w:p>
             <w:pPr>
@@ -3758,27 +4091,15 @@
                 <w:szCs w:val="28"/>
               </w:rPr>
             </w:pPr>
-            <w:proofErr w:type="spellStart"/>
-            <w:r>
-              <w:rPr>
-                <w:rFonts w:cs="Arial"/>
-                <w:b/>
-                <w:sz w:val="28"/>
-                <w:szCs w:val="28"/>
-              </w:rPr>
-              <w:t>Krama</w:t>
-            </w:r>
-            <w:proofErr w:type="spellEnd"/>
-            <w:r>
-              <w:rPr>
-                <w:rFonts w:cs="Arial"/>
-                <w:b/>
-                <w:sz w:val="28"/>
-                <w:szCs w:val="28"/>
-              </w:rPr>
-              <w:t xml:space="preserve"> </w:t>
-            </w:r>
-            <w:proofErr w:type="spellStart"/>
+            <w:r>
+              <w:rPr>
+                <w:rFonts w:cs="Arial"/>
+                <w:b/>
+                <w:sz w:val="28"/>
+                <w:szCs w:val="28"/>
+              </w:rPr>
+              <w:t xml:space="preserve">Krama </w:t>
+            </w:r>
             <w:r>
               <w:rPr>
                 <w:rFonts w:cs="Arial"/>
@@ -3788,7 +4109,6 @@
               </w:rPr>
               <w:t>Vaakyam</w:t>
             </w:r>
-            <w:proofErr w:type="spellEnd"/>
             <w:r>
               <w:rPr>
                 <w:rFonts w:cs="Arial"/>
@@ -3815,26 +4135,7 @@
                 <w:szCs w:val="28"/>
               </w:rPr>
               <w:br/>
-            </w:r>
-            <w:proofErr w:type="spellStart"/>
-            <w:r>
-              <w:rPr>
-                <w:rFonts w:cs="Arial"/>
-                <w:b/>
-                <w:sz w:val="28"/>
-                <w:szCs w:val="28"/>
-              </w:rPr>
-              <w:t>Panchaati</w:t>
-            </w:r>
-            <w:proofErr w:type="spellEnd"/>
-            <w:r>
-              <w:rPr>
-                <w:rFonts w:cs="Arial"/>
-                <w:b/>
-                <w:sz w:val="28"/>
-                <w:szCs w:val="28"/>
-              </w:rPr>
-              <w:t xml:space="preserve"> </w:t>
+              <w:t xml:space="preserve">Panchaati </w:t>
             </w:r>
             <w:r>
               <w:rPr>
@@ -4301,19 +4602,8 @@
                 <w:sz w:val="28"/>
                 <w:szCs w:val="28"/>
               </w:rPr>
-              <w:t xml:space="preserve">- </w:t>
-            </w:r>
-            <w:proofErr w:type="spellStart"/>
-            <w:r>
-              <w:rPr>
-                <w:rFonts w:cs="Arial"/>
-                <w:b/>
-                <w:sz w:val="28"/>
-                <w:szCs w:val="28"/>
-              </w:rPr>
-              <w:t>Kramam</w:t>
-            </w:r>
-            <w:proofErr w:type="spellEnd"/>
+              <w:t>- Kramam</w:t>
+            </w:r>
           </w:p>
           <w:p>
             <w:pPr>
@@ -4329,27 +4619,15 @@
                 <w:szCs w:val="28"/>
               </w:rPr>
             </w:pPr>
-            <w:proofErr w:type="spellStart"/>
-            <w:r>
-              <w:rPr>
-                <w:rFonts w:cs="Arial"/>
-                <w:b/>
-                <w:sz w:val="28"/>
-                <w:szCs w:val="28"/>
-              </w:rPr>
-              <w:t>Krama</w:t>
-            </w:r>
-            <w:proofErr w:type="spellEnd"/>
-            <w:r>
-              <w:rPr>
-                <w:rFonts w:cs="Arial"/>
-                <w:b/>
-                <w:sz w:val="28"/>
-                <w:szCs w:val="28"/>
-              </w:rPr>
-              <w:t xml:space="preserve"> </w:t>
-            </w:r>
-            <w:proofErr w:type="spellStart"/>
+            <w:r>
+              <w:rPr>
+                <w:rFonts w:cs="Arial"/>
+                <w:b/>
+                <w:sz w:val="28"/>
+                <w:szCs w:val="28"/>
+              </w:rPr>
+              <w:t xml:space="preserve">Krama </w:t>
+            </w:r>
             <w:r>
               <w:rPr>
                 <w:rFonts w:cs="Arial"/>
@@ -4359,7 +4637,6 @@
               </w:rPr>
               <w:t>Vaakyam</w:t>
             </w:r>
-            <w:proofErr w:type="spellEnd"/>
             <w:r>
               <w:rPr>
                 <w:rFonts w:cs="Arial"/>
@@ -4386,26 +4663,7 @@
                 <w:szCs w:val="28"/>
               </w:rPr>
               <w:br/>
-            </w:r>
-            <w:proofErr w:type="spellStart"/>
-            <w:r>
-              <w:rPr>
-                <w:rFonts w:cs="Arial"/>
-                <w:b/>
-                <w:sz w:val="28"/>
-                <w:szCs w:val="28"/>
-              </w:rPr>
-              <w:t>Panchaati</w:t>
-            </w:r>
-            <w:proofErr w:type="spellEnd"/>
-            <w:r>
-              <w:rPr>
-                <w:rFonts w:cs="Arial"/>
-                <w:b/>
-                <w:sz w:val="28"/>
-                <w:szCs w:val="28"/>
-              </w:rPr>
-              <w:t xml:space="preserve"> </w:t>
+              <w:t xml:space="preserve">Panchaati </w:t>
             </w:r>
             <w:r>
               <w:rPr>
@@ -4491,25 +4749,14 @@
               </w:rPr>
               <w:t>–</w:t>
             </w:r>
-            <w:proofErr w:type="spellStart"/>
-            <w:r>
-              <w:rPr>
-                <w:rFonts w:ascii="BRH Devanagari Extra" w:hAnsi="BRH Devanagari Extra" w:cs="BRH Devanagari Extra"/>
-                <w:color w:val="000000"/>
-                <w:sz w:val="40"/>
-                <w:szCs w:val="40"/>
-              </w:rPr>
-              <w:t>iÉç</w:t>
-            </w:r>
-            <w:proofErr w:type="spellEnd"/>
-            <w:r>
-              <w:rPr>
-                <w:rFonts w:ascii="BRH Devanagari Extra" w:hAnsi="BRH Devanagari Extra" w:cs="BRH Devanagari Extra"/>
-                <w:color w:val="000000"/>
-                <w:sz w:val="40"/>
-                <w:szCs w:val="40"/>
-              </w:rPr>
-              <w:t xml:space="preserve"> |</w:t>
+            <w:r>
+              <w:rPr>
+                <w:rFonts w:ascii="BRH Devanagari Extra" w:hAnsi="BRH Devanagari Extra" w:cs="BRH Devanagari Extra"/>
+                <w:color w:val="000000"/>
+                <w:sz w:val="40"/>
+                <w:szCs w:val="40"/>
+              </w:rPr>
+              <w:t>iÉç |</w:t>
             </w:r>
           </w:p>
         </w:tc>
@@ -4632,6 +4879,7 @@
                 <w:sz w:val="28"/>
                 <w:szCs w:val="28"/>
               </w:rPr>
+              <w:lastRenderedPageBreak/>
               <w:t>TS 2.2.8.6</w:t>
             </w:r>
             <w:r>
@@ -4650,19 +4898,8 @@
                 <w:sz w:val="28"/>
                 <w:szCs w:val="28"/>
               </w:rPr>
-              <w:t xml:space="preserve">- </w:t>
-            </w:r>
-            <w:proofErr w:type="spellStart"/>
-            <w:r>
-              <w:rPr>
-                <w:rFonts w:cs="Arial"/>
-                <w:b/>
-                <w:sz w:val="28"/>
-                <w:szCs w:val="28"/>
-              </w:rPr>
-              <w:t>Kramam</w:t>
-            </w:r>
-            <w:proofErr w:type="spellEnd"/>
+              <w:t>- Kramam</w:t>
+            </w:r>
           </w:p>
           <w:p>
             <w:pPr>
@@ -4678,27 +4915,15 @@
                 <w:szCs w:val="28"/>
               </w:rPr>
             </w:pPr>
-            <w:proofErr w:type="spellStart"/>
-            <w:r>
-              <w:rPr>
-                <w:rFonts w:cs="Arial"/>
-                <w:b/>
-                <w:sz w:val="28"/>
-                <w:szCs w:val="28"/>
-              </w:rPr>
-              <w:t>Krama</w:t>
-            </w:r>
-            <w:proofErr w:type="spellEnd"/>
-            <w:r>
-              <w:rPr>
-                <w:rFonts w:cs="Arial"/>
-                <w:b/>
-                <w:sz w:val="28"/>
-                <w:szCs w:val="28"/>
-              </w:rPr>
-              <w:t xml:space="preserve"> </w:t>
-            </w:r>
-            <w:proofErr w:type="spellStart"/>
+            <w:r>
+              <w:rPr>
+                <w:rFonts w:cs="Arial"/>
+                <w:b/>
+                <w:sz w:val="28"/>
+                <w:szCs w:val="28"/>
+              </w:rPr>
+              <w:t xml:space="preserve">Krama </w:t>
+            </w:r>
             <w:r>
               <w:rPr>
                 <w:rFonts w:cs="Arial"/>
@@ -4708,7 +4933,6 @@
               </w:rPr>
               <w:t>Vaakyam</w:t>
             </w:r>
-            <w:proofErr w:type="spellEnd"/>
             <w:r>
               <w:rPr>
                 <w:rFonts w:cs="Arial"/>
@@ -4735,26 +4959,7 @@
                 <w:szCs w:val="28"/>
               </w:rPr>
               <w:br/>
-            </w:r>
-            <w:proofErr w:type="spellStart"/>
-            <w:r>
-              <w:rPr>
-                <w:rFonts w:cs="Arial"/>
-                <w:b/>
-                <w:sz w:val="28"/>
-                <w:szCs w:val="28"/>
-              </w:rPr>
-              <w:t>Panchaati</w:t>
-            </w:r>
-            <w:proofErr w:type="spellEnd"/>
-            <w:r>
-              <w:rPr>
-                <w:rFonts w:cs="Arial"/>
-                <w:b/>
-                <w:sz w:val="28"/>
-                <w:szCs w:val="28"/>
-              </w:rPr>
-              <w:t xml:space="preserve"> </w:t>
+              <w:t xml:space="preserve">Panchaati </w:t>
             </w:r>
             <w:r>
               <w:rPr>
@@ -4788,7 +4993,6 @@
                 <w:cs/>
               </w:rPr>
             </w:pPr>
-            <w:proofErr w:type="spellStart"/>
             <w:r>
               <w:rPr>
                 <w:rFonts w:ascii="BRH Devanagari Extra" w:hAnsi="BRH Devanagari Extra" w:cs="BRH Devanagari Extra"/>
@@ -4798,7 +5002,6 @@
               </w:rPr>
               <w:t>xÉ</w:t>
             </w:r>
-            <w:proofErr w:type="spellEnd"/>
             <w:r>
               <w:rPr>
                 <w:rFonts w:ascii="BRH Malayalam Extra" w:hAnsi="BRH Malayalam Extra" w:cs="BRH Devanagari Extra"/>
@@ -4846,17 +5049,17 @@
                 <w:sz w:val="40"/>
                 <w:szCs w:val="40"/>
               </w:rPr>
-              <w:t xml:space="preserve"> </w:t>
-            </w:r>
-            <w:proofErr w:type="spellStart"/>
-            <w:r>
-              <w:rPr>
-                <w:rFonts w:ascii="BRH Devanagari Extra" w:hAnsi="BRH Devanagari Extra" w:cs="BRH Devanagari Extra"/>
-                <w:color w:val="000000"/>
-                <w:sz w:val="40"/>
-                <w:szCs w:val="40"/>
-              </w:rPr>
-              <w:t>xÉ-SØ</w:t>
+              <w:t xml:space="preserve"> xÉ-</w:t>
+            </w:r>
+            <w:proofErr w:type="spellStart"/>
+            <w:r>
+              <w:rPr>
+                <w:rFonts w:ascii="BRH Devanagari Extra" w:hAnsi="BRH Devanagari Extra" w:cs="BRH Devanagari Extra"/>
+                <w:color w:val="000000"/>
+                <w:sz w:val="40"/>
+                <w:szCs w:val="40"/>
+              </w:rPr>
+              <w:t>SØ</w:t>
             </w:r>
             <w:r>
               <w:rPr>
@@ -4910,7 +5113,6 @@
                 <w:cs/>
               </w:rPr>
             </w:pPr>
-            <w:proofErr w:type="spellStart"/>
             <w:r>
               <w:rPr>
                 <w:rFonts w:ascii="BRH Devanagari Extra" w:hAnsi="BRH Devanagari Extra" w:cs="BRH Devanagari Extra"/>
@@ -4920,7 +5122,6 @@
               </w:rPr>
               <w:t>xÉ</w:t>
             </w:r>
-            <w:proofErr w:type="spellEnd"/>
             <w:r>
               <w:rPr>
                 <w:rFonts w:ascii="BRH Malayalam Extra" w:hAnsi="BRH Malayalam Extra" w:cs="BRH Devanagari Extra"/>
@@ -4986,17 +5187,17 @@
                 <w:sz w:val="40"/>
                 <w:szCs w:val="40"/>
               </w:rPr>
-              <w:t xml:space="preserve"> </w:t>
-            </w:r>
-            <w:proofErr w:type="spellStart"/>
-            <w:r>
-              <w:rPr>
-                <w:rFonts w:ascii="BRH Devanagari Extra" w:hAnsi="BRH Devanagari Extra" w:cs="BRH Devanagari Extra"/>
-                <w:color w:val="000000"/>
-                <w:sz w:val="40"/>
-                <w:szCs w:val="40"/>
-              </w:rPr>
-              <w:t>xÉ-SØ</w:t>
+              <w:t xml:space="preserve"> xÉ-</w:t>
+            </w:r>
+            <w:proofErr w:type="spellStart"/>
+            <w:r>
+              <w:rPr>
+                <w:rFonts w:ascii="BRH Devanagari Extra" w:hAnsi="BRH Devanagari Extra" w:cs="BRH Devanagari Extra"/>
+                <w:color w:val="000000"/>
+                <w:sz w:val="40"/>
+                <w:szCs w:val="40"/>
+              </w:rPr>
+              <w:t>SØ</w:t>
             </w:r>
             <w:r>
               <w:rPr>
@@ -5074,19 +5275,8 @@
                 <w:sz w:val="28"/>
                 <w:szCs w:val="28"/>
               </w:rPr>
-              <w:t xml:space="preserve">- </w:t>
-            </w:r>
-            <w:proofErr w:type="spellStart"/>
-            <w:r>
-              <w:rPr>
-                <w:rFonts w:cs="Arial"/>
-                <w:b/>
-                <w:sz w:val="28"/>
-                <w:szCs w:val="28"/>
-              </w:rPr>
-              <w:t>Kramam</w:t>
-            </w:r>
-            <w:proofErr w:type="spellEnd"/>
+              <w:t>- Kramam</w:t>
+            </w:r>
           </w:p>
           <w:p>
             <w:pPr>
@@ -5102,27 +5292,15 @@
                 <w:szCs w:val="28"/>
               </w:rPr>
             </w:pPr>
-            <w:proofErr w:type="spellStart"/>
-            <w:r>
-              <w:rPr>
-                <w:rFonts w:cs="Arial"/>
-                <w:b/>
-                <w:sz w:val="28"/>
-                <w:szCs w:val="28"/>
-              </w:rPr>
-              <w:t>Krama</w:t>
-            </w:r>
-            <w:proofErr w:type="spellEnd"/>
-            <w:r>
-              <w:rPr>
-                <w:rFonts w:cs="Arial"/>
-                <w:b/>
-                <w:sz w:val="28"/>
-                <w:szCs w:val="28"/>
-              </w:rPr>
-              <w:t xml:space="preserve"> </w:t>
-            </w:r>
-            <w:proofErr w:type="spellStart"/>
+            <w:r>
+              <w:rPr>
+                <w:rFonts w:cs="Arial"/>
+                <w:b/>
+                <w:sz w:val="28"/>
+                <w:szCs w:val="28"/>
+              </w:rPr>
+              <w:t xml:space="preserve">Krama </w:t>
+            </w:r>
             <w:r>
               <w:rPr>
                 <w:rFonts w:cs="Arial"/>
@@ -5132,7 +5310,6 @@
               </w:rPr>
               <w:t>Vaakyam</w:t>
             </w:r>
-            <w:proofErr w:type="spellEnd"/>
             <w:r>
               <w:rPr>
                 <w:rFonts w:cs="Arial"/>
@@ -5159,26 +5336,7 @@
                 <w:szCs w:val="28"/>
               </w:rPr>
               <w:br/>
-            </w:r>
-            <w:proofErr w:type="spellStart"/>
-            <w:r>
-              <w:rPr>
-                <w:rFonts w:cs="Arial"/>
-                <w:b/>
-                <w:sz w:val="28"/>
-                <w:szCs w:val="28"/>
-              </w:rPr>
-              <w:t>Panchaati</w:t>
-            </w:r>
-            <w:proofErr w:type="spellEnd"/>
-            <w:r>
-              <w:rPr>
-                <w:rFonts w:cs="Arial"/>
-                <w:b/>
-                <w:sz w:val="28"/>
-                <w:szCs w:val="28"/>
-              </w:rPr>
-              <w:t xml:space="preserve"> </w:t>
+              <w:t xml:space="preserve">Panchaati </w:t>
             </w:r>
             <w:r>
               <w:rPr>
@@ -5257,25 +5415,14 @@
               </w:rPr>
               <w:t>–</w:t>
             </w:r>
-            <w:proofErr w:type="spellStart"/>
-            <w:r>
-              <w:rPr>
-                <w:rFonts w:ascii="BRH Devanagari Extra" w:hAnsi="BRH Devanagari Extra" w:cs="BRH Devanagari Extra"/>
-                <w:color w:val="000000"/>
-                <w:sz w:val="40"/>
-                <w:szCs w:val="40"/>
-              </w:rPr>
-              <w:t>iÉç</w:t>
-            </w:r>
-            <w:proofErr w:type="spellEnd"/>
-            <w:r>
-              <w:rPr>
-                <w:rFonts w:ascii="BRH Devanagari Extra" w:hAnsi="BRH Devanagari Extra" w:cs="BRH Devanagari Extra"/>
-                <w:color w:val="000000"/>
-                <w:sz w:val="40"/>
-                <w:szCs w:val="40"/>
-              </w:rPr>
-              <w:t xml:space="preserve"> |</w:t>
+            <w:r>
+              <w:rPr>
+                <w:rFonts w:ascii="BRH Devanagari Extra" w:hAnsi="BRH Devanagari Extra" w:cs="BRH Devanagari Extra"/>
+                <w:color w:val="000000"/>
+                <w:sz w:val="40"/>
+                <w:szCs w:val="40"/>
+              </w:rPr>
+              <w:t>iÉç |</w:t>
             </w:r>
             <w:r>
               <w:rPr>
@@ -5432,19 +5579,8 @@
                 <w:sz w:val="28"/>
                 <w:szCs w:val="28"/>
               </w:rPr>
-              <w:t xml:space="preserve">- </w:t>
-            </w:r>
-            <w:proofErr w:type="spellStart"/>
-            <w:r>
-              <w:rPr>
-                <w:rFonts w:cs="Arial"/>
-                <w:b/>
-                <w:sz w:val="28"/>
-                <w:szCs w:val="28"/>
-              </w:rPr>
-              <w:t>Kramam</w:t>
-            </w:r>
-            <w:proofErr w:type="spellEnd"/>
+              <w:t>- Kramam</w:t>
+            </w:r>
           </w:p>
           <w:p>
             <w:pPr>
@@ -5460,27 +5596,15 @@
                 <w:szCs w:val="28"/>
               </w:rPr>
             </w:pPr>
-            <w:proofErr w:type="spellStart"/>
-            <w:r>
-              <w:rPr>
-                <w:rFonts w:cs="Arial"/>
-                <w:b/>
-                <w:sz w:val="28"/>
-                <w:szCs w:val="28"/>
-              </w:rPr>
-              <w:t>Krama</w:t>
-            </w:r>
-            <w:proofErr w:type="spellEnd"/>
-            <w:r>
-              <w:rPr>
-                <w:rFonts w:cs="Arial"/>
-                <w:b/>
-                <w:sz w:val="28"/>
-                <w:szCs w:val="28"/>
-              </w:rPr>
-              <w:t xml:space="preserve"> </w:t>
-            </w:r>
-            <w:proofErr w:type="spellStart"/>
+            <w:r>
+              <w:rPr>
+                <w:rFonts w:cs="Arial"/>
+                <w:b/>
+                <w:sz w:val="28"/>
+                <w:szCs w:val="28"/>
+              </w:rPr>
+              <w:t xml:space="preserve">Krama </w:t>
+            </w:r>
             <w:r>
               <w:rPr>
                 <w:rFonts w:cs="Arial"/>
@@ -5490,7 +5614,6 @@
               </w:rPr>
               <w:t>Vaakyam</w:t>
             </w:r>
-            <w:proofErr w:type="spellEnd"/>
             <w:r>
               <w:rPr>
                 <w:rFonts w:cs="Arial"/>
@@ -5517,26 +5640,7 @@
                 <w:szCs w:val="28"/>
               </w:rPr>
               <w:br/>
-            </w:r>
-            <w:proofErr w:type="spellStart"/>
-            <w:r>
-              <w:rPr>
-                <w:rFonts w:cs="Arial"/>
-                <w:b/>
-                <w:sz w:val="28"/>
-                <w:szCs w:val="28"/>
-              </w:rPr>
-              <w:t>Panchaati</w:t>
-            </w:r>
-            <w:proofErr w:type="spellEnd"/>
-            <w:r>
-              <w:rPr>
-                <w:rFonts w:cs="Arial"/>
-                <w:b/>
-                <w:sz w:val="28"/>
-                <w:szCs w:val="28"/>
-              </w:rPr>
-              <w:t xml:space="preserve"> </w:t>
+              <w:t xml:space="preserve">Panchaati </w:t>
             </w:r>
             <w:r>
               <w:rPr>
@@ -5589,7 +5693,6 @@
               </w:rPr>
               <w:t>–</w:t>
             </w:r>
-            <w:proofErr w:type="spellStart"/>
             <w:r>
               <w:rPr>
                 <w:rFonts w:ascii="BRH Devanagari Extra" w:hAnsi="BRH Devanagari Extra" w:cs="BRH Devanagari Extra"/>
@@ -5599,7 +5702,6 @@
               </w:rPr>
               <w:t>uÉ</w:t>
             </w:r>
-            <w:proofErr w:type="spellEnd"/>
             <w:r>
               <w:rPr>
                 <w:rFonts w:ascii="BRH Malayalam Extra" w:hAnsi="BRH Malayalam Extra" w:cs="BRH Devanagari Extra"/>
@@ -5723,7 +5825,6 @@
               </w:rPr>
               <w:t>–</w:t>
             </w:r>
-            <w:proofErr w:type="spellStart"/>
             <w:r>
               <w:rPr>
                 <w:rFonts w:ascii="BRH Devanagari Extra" w:hAnsi="BRH Devanagari Extra" w:cs="BRH Devanagari Extra"/>
@@ -5733,7 +5834,6 @@
               </w:rPr>
               <w:t>uÉ</w:t>
             </w:r>
-            <w:proofErr w:type="spellEnd"/>
             <w:r>
               <w:rPr>
                 <w:rFonts w:ascii="BRH Malayalam Extra" w:hAnsi="BRH Malayalam Extra" w:cs="BRH Devanagari Extra"/>
@@ -5852,8 +5952,6 @@
           <w:u w:val="single"/>
         </w:rPr>
       </w:pPr>
-      <w:bookmarkStart w:id="0" w:name="_GoBack"/>
-      <w:bookmarkEnd w:id="0"/>
     </w:p>
     <w:p>
       <w:pPr>
@@ -5874,10 +5972,8 @@
           <w:szCs w:val="32"/>
           <w:u w:val="single"/>
         </w:rPr>
-        <w:lastRenderedPageBreak/>
         <w:t xml:space="preserve">TS </w:t>
       </w:r>
-      <w:proofErr w:type="spellStart"/>
       <w:r>
         <w:rPr>
           <w:b/>
@@ -5888,7 +5984,6 @@
         </w:rPr>
         <w:t>Krama</w:t>
       </w:r>
-      <w:proofErr w:type="spellEnd"/>
       <w:r>
         <w:rPr>
           <w:b/>
@@ -5897,29 +5992,7 @@
           <w:szCs w:val="32"/>
           <w:u w:val="single"/>
         </w:rPr>
-        <w:t xml:space="preserve"> </w:t>
-      </w:r>
-      <w:proofErr w:type="spellStart"/>
-      <w:r>
-        <w:rPr>
-          <w:b/>
-          <w:bCs/>
-          <w:sz w:val="32"/>
-          <w:szCs w:val="32"/>
-          <w:u w:val="single"/>
-        </w:rPr>
-        <w:t>Paatam</w:t>
-      </w:r>
-      <w:proofErr w:type="spellEnd"/>
-      <w:r>
-        <w:rPr>
-          <w:b/>
-          <w:bCs/>
-          <w:sz w:val="32"/>
-          <w:szCs w:val="32"/>
-          <w:u w:val="single"/>
-        </w:rPr>
-        <w:t xml:space="preserve"> – TS </w:t>
+        <w:t xml:space="preserve"> Paatam – TS </w:t>
       </w:r>
       <w:r>
         <w:rPr>
@@ -6265,55 +6338,33 @@
                 <w:lang w:bidi="ta-IN"/>
               </w:rPr>
             </w:pPr>
-            <w:proofErr w:type="spellStart"/>
-            <w:r>
-              <w:rPr>
-                <w:rFonts w:ascii="BRH Devanagari Extra" w:hAnsi="BRH Devanagari Extra" w:cs="BRH Devanagari Extra"/>
-                <w:color w:val="000000"/>
-                <w:sz w:val="40"/>
-                <w:szCs w:val="40"/>
-              </w:rPr>
-              <w:t>xÉ</w:t>
-            </w:r>
-            <w:proofErr w:type="spellEnd"/>
-            <w:r>
-              <w:rPr>
-                <w:rFonts w:ascii="BRH Devanagari Extra" w:hAnsi="BRH Devanagari Extra" w:cs="BRH Devanagari Extra"/>
-                <w:color w:val="000000"/>
-                <w:sz w:val="40"/>
-                <w:szCs w:val="40"/>
-              </w:rPr>
-              <w:t xml:space="preserve"> L</w:t>
-            </w:r>
-            <w:r>
-              <w:rPr>
-                <w:rFonts w:ascii="BRH Malayalam Extra" w:hAnsi="BRH Malayalam Extra" w:cs="BRH Devanagari Extra"/>
-                <w:b/>
-                <w:color w:val="000000"/>
-                <w:sz w:val="32"/>
-                <w:szCs w:val="40"/>
-              </w:rPr>
-              <w:t>–</w:t>
-            </w:r>
-            <w:proofErr w:type="spellStart"/>
-            <w:r>
-              <w:rPr>
-                <w:rFonts w:ascii="BRH Devanagari Extra" w:hAnsi="BRH Devanagari Extra" w:cs="BRH Devanagari Extra"/>
-                <w:color w:val="000000"/>
-                <w:sz w:val="40"/>
-                <w:szCs w:val="40"/>
-              </w:rPr>
-              <w:t>uÉ</w:t>
-            </w:r>
-            <w:proofErr w:type="spellEnd"/>
-            <w:r>
-              <w:rPr>
-                <w:rFonts w:ascii="BRH Devanagari Extra" w:hAnsi="BRH Devanagari Extra" w:cs="BRH Devanagari Extra"/>
-                <w:color w:val="000000"/>
-                <w:sz w:val="40"/>
-                <w:szCs w:val="40"/>
-              </w:rPr>
-              <w:t xml:space="preserve"> | </w:t>
+            <w:r>
+              <w:rPr>
+                <w:rFonts w:ascii="BRH Devanagari Extra" w:hAnsi="BRH Devanagari Extra" w:cs="BRH Devanagari Extra"/>
+                <w:color w:val="000000"/>
+                <w:sz w:val="40"/>
+                <w:szCs w:val="40"/>
+              </w:rPr>
+              <w:t>xÉ L</w:t>
+            </w:r>
+            <w:r>
+              <w:rPr>
+                <w:rFonts w:ascii="BRH Malayalam Extra" w:hAnsi="BRH Malayalam Extra" w:cs="BRH Devanagari Extra"/>
+                <w:b/>
+                <w:color w:val="000000"/>
+                <w:sz w:val="32"/>
+                <w:szCs w:val="40"/>
+              </w:rPr>
+              <w:t>–</w:t>
+            </w:r>
+            <w:r>
+              <w:rPr>
+                <w:rFonts w:ascii="BRH Devanagari Extra" w:hAnsi="BRH Devanagari Extra" w:cs="BRH Devanagari Extra"/>
+                <w:color w:val="000000"/>
+                <w:sz w:val="40"/>
+                <w:szCs w:val="40"/>
+              </w:rPr>
+              <w:t xml:space="preserve">uÉ | </w:t>
             </w:r>
             <w:proofErr w:type="spellStart"/>
             <w:r>
@@ -6366,55 +6417,33 @@
                 <w:lang w:bidi="ta-IN"/>
               </w:rPr>
             </w:pPr>
-            <w:proofErr w:type="spellStart"/>
-            <w:r>
-              <w:rPr>
-                <w:rFonts w:ascii="BRH Devanagari Extra" w:hAnsi="BRH Devanagari Extra" w:cs="BRH Devanagari Extra"/>
-                <w:color w:val="000000"/>
-                <w:sz w:val="40"/>
-                <w:szCs w:val="40"/>
-              </w:rPr>
-              <w:t>xÉ</w:t>
-            </w:r>
-            <w:proofErr w:type="spellEnd"/>
-            <w:r>
-              <w:rPr>
-                <w:rFonts w:ascii="BRH Devanagari Extra" w:hAnsi="BRH Devanagari Extra" w:cs="BRH Devanagari Extra"/>
-                <w:color w:val="000000"/>
-                <w:sz w:val="40"/>
-                <w:szCs w:val="40"/>
-              </w:rPr>
-              <w:t xml:space="preserve"> L</w:t>
-            </w:r>
-            <w:r>
-              <w:rPr>
-                <w:rFonts w:ascii="BRH Malayalam Extra" w:hAnsi="BRH Malayalam Extra" w:cs="BRH Devanagari Extra"/>
-                <w:b/>
-                <w:color w:val="000000"/>
-                <w:sz w:val="32"/>
-                <w:szCs w:val="40"/>
-              </w:rPr>
-              <w:t>–</w:t>
-            </w:r>
-            <w:proofErr w:type="spellStart"/>
-            <w:r>
-              <w:rPr>
-                <w:rFonts w:ascii="BRH Devanagari Extra" w:hAnsi="BRH Devanagari Extra" w:cs="BRH Devanagari Extra"/>
-                <w:color w:val="000000"/>
-                <w:sz w:val="40"/>
-                <w:szCs w:val="40"/>
-              </w:rPr>
-              <w:t>uÉ</w:t>
-            </w:r>
-            <w:proofErr w:type="spellEnd"/>
-            <w:r>
-              <w:rPr>
-                <w:rFonts w:ascii="BRH Devanagari Extra" w:hAnsi="BRH Devanagari Extra" w:cs="BRH Devanagari Extra"/>
-                <w:color w:val="000000"/>
-                <w:sz w:val="40"/>
-                <w:szCs w:val="40"/>
-              </w:rPr>
-              <w:t xml:space="preserve"> | </w:t>
+            <w:r>
+              <w:rPr>
+                <w:rFonts w:ascii="BRH Devanagari Extra" w:hAnsi="BRH Devanagari Extra" w:cs="BRH Devanagari Extra"/>
+                <w:color w:val="000000"/>
+                <w:sz w:val="40"/>
+                <w:szCs w:val="40"/>
+              </w:rPr>
+              <w:t>xÉ L</w:t>
+            </w:r>
+            <w:r>
+              <w:rPr>
+                <w:rFonts w:ascii="BRH Malayalam Extra" w:hAnsi="BRH Malayalam Extra" w:cs="BRH Devanagari Extra"/>
+                <w:b/>
+                <w:color w:val="000000"/>
+                <w:sz w:val="32"/>
+                <w:szCs w:val="40"/>
+              </w:rPr>
+              <w:t>–</w:t>
+            </w:r>
+            <w:r>
+              <w:rPr>
+                <w:rFonts w:ascii="BRH Devanagari Extra" w:hAnsi="BRH Devanagari Extra" w:cs="BRH Devanagari Extra"/>
+                <w:color w:val="000000"/>
+                <w:sz w:val="40"/>
+                <w:szCs w:val="40"/>
+              </w:rPr>
+              <w:t xml:space="preserve">uÉ | </w:t>
             </w:r>
             <w:r>
               <w:rPr>
@@ -6608,7 +6637,6 @@
                 <w:cs/>
               </w:rPr>
             </w:pPr>
-            <w:proofErr w:type="spellStart"/>
             <w:r>
               <w:rPr>
                 <w:rFonts w:ascii="BRH Devanagari Extra" w:hAnsi="BRH Devanagari Extra" w:cs="BRH Devanagari Extra"/>
@@ -6618,18 +6646,16 @@
               </w:rPr>
               <w:t>pÉ</w:t>
             </w:r>
-            <w:proofErr w:type="spellEnd"/>
-            <w:r>
-              <w:rPr>
-                <w:rFonts w:ascii="BRH Malayalam Extra" w:hAnsi="BRH Malayalam Extra" w:cs="BRH Devanagari Extra"/>
-                <w:b/>
-                <w:color w:val="000000"/>
-                <w:sz w:val="32"/>
-                <w:szCs w:val="40"/>
-              </w:rPr>
-              <w:t>–</w:t>
-            </w:r>
-            <w:proofErr w:type="spellStart"/>
+            <w:r>
+              <w:rPr>
+                <w:rFonts w:ascii="BRH Malayalam Extra" w:hAnsi="BRH Malayalam Extra" w:cs="BRH Devanagari Extra"/>
+                <w:b/>
+                <w:color w:val="000000"/>
+                <w:sz w:val="32"/>
+                <w:szCs w:val="40"/>
+              </w:rPr>
+              <w:t>–</w:t>
+            </w:r>
             <w:r>
               <w:rPr>
                 <w:rFonts w:ascii="BRH Devanagari Extra" w:hAnsi="BRH Devanagari Extra" w:cs="BRH Devanagari Extra"/>
@@ -6639,18 +6665,16 @@
               </w:rPr>
               <w:t>uÉ</w:t>
             </w:r>
-            <w:proofErr w:type="spellEnd"/>
-            <w:r>
-              <w:rPr>
-                <w:rFonts w:ascii="BRH Malayalam Extra" w:hAnsi="BRH Malayalam Extra" w:cs="BRH Devanagari Extra"/>
-                <w:b/>
-                <w:color w:val="000000"/>
-                <w:sz w:val="32"/>
-                <w:szCs w:val="40"/>
-              </w:rPr>
-              <w:t>–</w:t>
-            </w:r>
-            <w:proofErr w:type="spellStart"/>
+            <w:r>
+              <w:rPr>
+                <w:rFonts w:ascii="BRH Malayalam Extra" w:hAnsi="BRH Malayalam Extra" w:cs="BRH Devanagari Extra"/>
+                <w:b/>
+                <w:color w:val="000000"/>
+                <w:sz w:val="32"/>
+                <w:szCs w:val="40"/>
+              </w:rPr>
+              <w:t>–</w:t>
+            </w:r>
             <w:r>
               <w:rPr>
                 <w:rFonts w:ascii="BRH Devanagari Extra" w:hAnsi="BRH Devanagari Extra" w:cs="BRH Devanagari Extra"/>
@@ -6660,7 +6684,6 @@
               </w:rPr>
               <w:t>irÉ</w:t>
             </w:r>
-            <w:proofErr w:type="spellEnd"/>
             <w:r>
               <w:rPr>
                 <w:rFonts w:ascii="BRH Malayalam Extra" w:hAnsi="BRH Malayalam Extra" w:cs="BRH Devanagari Extra"/>
@@ -6754,7 +6777,6 @@
                 <w:cs/>
               </w:rPr>
             </w:pPr>
-            <w:proofErr w:type="spellStart"/>
             <w:r>
               <w:rPr>
                 <w:rFonts w:ascii="BRH Devanagari Extra" w:hAnsi="BRH Devanagari Extra" w:cs="BRH Devanagari Extra"/>
@@ -6764,18 +6786,16 @@
               </w:rPr>
               <w:t>pÉ</w:t>
             </w:r>
-            <w:proofErr w:type="spellEnd"/>
-            <w:r>
-              <w:rPr>
-                <w:rFonts w:ascii="BRH Malayalam Extra" w:hAnsi="BRH Malayalam Extra" w:cs="BRH Devanagari Extra"/>
-                <w:b/>
-                <w:color w:val="000000"/>
-                <w:sz w:val="32"/>
-                <w:szCs w:val="40"/>
-              </w:rPr>
-              <w:t>–</w:t>
-            </w:r>
-            <w:proofErr w:type="spellStart"/>
+            <w:r>
+              <w:rPr>
+                <w:rFonts w:ascii="BRH Malayalam Extra" w:hAnsi="BRH Malayalam Extra" w:cs="BRH Devanagari Extra"/>
+                <w:b/>
+                <w:color w:val="000000"/>
+                <w:sz w:val="32"/>
+                <w:szCs w:val="40"/>
+              </w:rPr>
+              <w:t>–</w:t>
+            </w:r>
             <w:r>
               <w:rPr>
                 <w:rFonts w:ascii="BRH Devanagari Extra" w:hAnsi="BRH Devanagari Extra" w:cs="BRH Devanagari Extra"/>
@@ -6785,18 +6805,16 @@
               </w:rPr>
               <w:t>uÉ</w:t>
             </w:r>
-            <w:proofErr w:type="spellEnd"/>
-            <w:r>
-              <w:rPr>
-                <w:rFonts w:ascii="BRH Malayalam Extra" w:hAnsi="BRH Malayalam Extra" w:cs="BRH Devanagari Extra"/>
-                <w:b/>
-                <w:color w:val="000000"/>
-                <w:sz w:val="32"/>
-                <w:szCs w:val="40"/>
-              </w:rPr>
-              <w:t>–</w:t>
-            </w:r>
-            <w:proofErr w:type="spellStart"/>
+            <w:r>
+              <w:rPr>
+                <w:rFonts w:ascii="BRH Malayalam Extra" w:hAnsi="BRH Malayalam Extra" w:cs="BRH Devanagari Extra"/>
+                <w:b/>
+                <w:color w:val="000000"/>
+                <w:sz w:val="32"/>
+                <w:szCs w:val="40"/>
+              </w:rPr>
+              <w:t>–</w:t>
+            </w:r>
             <w:r>
               <w:rPr>
                 <w:rFonts w:ascii="BRH Devanagari Extra" w:hAnsi="BRH Devanagari Extra" w:cs="BRH Devanagari Extra"/>
@@ -6806,7 +6824,6 @@
               </w:rPr>
               <w:t>irÉ</w:t>
             </w:r>
-            <w:proofErr w:type="spellEnd"/>
             <w:r>
               <w:rPr>
                 <w:rFonts w:ascii="BRH Malayalam Extra" w:hAnsi="BRH Malayalam Extra" w:cs="BRH Devanagari Extra"/>
@@ -7076,7 +7093,6 @@
               </w:rPr>
               <w:t>–</w:t>
             </w:r>
-            <w:proofErr w:type="spellStart"/>
             <w:r>
               <w:rPr>
                 <w:rFonts w:ascii="BRH Devanagari Extra" w:hAnsi="BRH Devanagari Extra" w:cs="BRH Devanagari Extra"/>
@@ -7085,7 +7101,6 @@
               </w:rPr>
               <w:t>lÉ</w:t>
             </w:r>
-            <w:proofErr w:type="spellEnd"/>
             <w:r>
               <w:rPr>
                 <w:rFonts w:ascii="BRH Malayalam Extra" w:hAnsi="BRH Malayalam Extra" w:cs="BRH Devanagari Extra"/>
@@ -7138,6 +7153,7 @@
                 <w:szCs w:val="40"/>
                 <w:highlight w:val="yellow"/>
               </w:rPr>
+              <w:lastRenderedPageBreak/>
               <w:t>²É</w:t>
             </w:r>
             <w:r>
@@ -7166,23 +7182,13 @@
               </w:rPr>
               <w:t>–</w:t>
             </w:r>
-            <w:proofErr w:type="spellStart"/>
-            <w:r>
-              <w:rPr>
-                <w:rFonts w:ascii="BRH Devanagari Extra" w:hAnsi="BRH Devanagari Extra" w:cs="BRH Devanagari Extra"/>
-                <w:sz w:val="40"/>
-                <w:szCs w:val="40"/>
-              </w:rPr>
-              <w:t>qÉç</w:t>
-            </w:r>
-            <w:proofErr w:type="spellEnd"/>
-            <w:r>
-              <w:rPr>
-                <w:rFonts w:ascii="BRH Devanagari Extra" w:hAnsi="BRH Devanagari Extra" w:cs="BRH Devanagari Extra"/>
-                <w:sz w:val="40"/>
-                <w:szCs w:val="40"/>
-              </w:rPr>
-              <w:t xml:space="preserve"> </w:t>
+            <w:r>
+              <w:rPr>
+                <w:rFonts w:ascii="BRH Devanagari Extra" w:hAnsi="BRH Devanagari Extra" w:cs="BRH Devanagari Extra"/>
+                <w:sz w:val="40"/>
+                <w:szCs w:val="40"/>
+              </w:rPr>
+              <w:t xml:space="preserve">qÉç </w:t>
             </w:r>
             <w:proofErr w:type="spellStart"/>
             <w:r>
@@ -7232,6 +7238,7 @@
                 <w:sz w:val="40"/>
                 <w:szCs w:val="40"/>
               </w:rPr>
+              <w:lastRenderedPageBreak/>
               <w:t>uÉæ</w:t>
             </w:r>
             <w:proofErr w:type="spellEnd"/>
@@ -7264,7 +7271,6 @@
               </w:rPr>
               <w:t>–</w:t>
             </w:r>
-            <w:proofErr w:type="spellStart"/>
             <w:r>
               <w:rPr>
                 <w:rFonts w:ascii="BRH Devanagari Extra" w:hAnsi="BRH Devanagari Extra" w:cs="BRH Devanagari Extra"/>
@@ -7274,7 +7280,6 @@
               </w:rPr>
               <w:t>lÉ</w:t>
             </w:r>
-            <w:proofErr w:type="spellEnd"/>
             <w:r>
               <w:rPr>
                 <w:rFonts w:ascii="BRH Malayalam Extra" w:hAnsi="BRH Malayalam Extra" w:cs="BRH Devanagari Extra"/>
@@ -7324,6 +7329,7 @@
                 <w:sz w:val="40"/>
                 <w:szCs w:val="40"/>
               </w:rPr>
+              <w:lastRenderedPageBreak/>
               <w:t>²É</w:t>
             </w:r>
             <w:r>
@@ -7355,25 +7361,14 @@
               </w:rPr>
               <w:t>–</w:t>
             </w:r>
-            <w:proofErr w:type="spellStart"/>
-            <w:r>
-              <w:rPr>
-                <w:rFonts w:ascii="BRH Devanagari Extra" w:hAnsi="BRH Devanagari Extra" w:cs="BRH Devanagari Extra"/>
-                <w:color w:val="000000"/>
-                <w:sz w:val="40"/>
-                <w:szCs w:val="40"/>
-              </w:rPr>
-              <w:t>qÉç</w:t>
-            </w:r>
-            <w:proofErr w:type="spellEnd"/>
-            <w:r>
-              <w:rPr>
-                <w:rFonts w:ascii="BRH Devanagari Extra" w:hAnsi="BRH Devanagari Extra" w:cs="BRH Devanagari Extra"/>
-                <w:color w:val="000000"/>
-                <w:sz w:val="40"/>
-                <w:szCs w:val="40"/>
-              </w:rPr>
-              <w:t xml:space="preserve"> </w:t>
+            <w:r>
+              <w:rPr>
+                <w:rFonts w:ascii="BRH Devanagari Extra" w:hAnsi="BRH Devanagari Extra" w:cs="BRH Devanagari Extra"/>
+                <w:color w:val="000000"/>
+                <w:sz w:val="40"/>
+                <w:szCs w:val="40"/>
+              </w:rPr>
+              <w:t xml:space="preserve">qÉç </w:t>
             </w:r>
             <w:proofErr w:type="spellStart"/>
             <w:r>
@@ -7442,6 +7437,7 @@
                 <w:sz w:val="28"/>
                 <w:szCs w:val="28"/>
               </w:rPr>
+              <w:lastRenderedPageBreak/>
               <w:t>TS 2.2.9.2</w:t>
             </w:r>
             <w:r>
@@ -7558,25 +7554,14 @@
                 <w:szCs w:val="40"/>
               </w:rPr>
             </w:pPr>
-            <w:proofErr w:type="spellStart"/>
-            <w:r>
-              <w:rPr>
-                <w:rFonts w:ascii="BRH Devanagari Extra" w:hAnsi="BRH Devanagari Extra" w:cs="BRH Devanagari Extra"/>
-                <w:color w:val="000000"/>
-                <w:sz w:val="40"/>
-                <w:szCs w:val="40"/>
-              </w:rPr>
-              <w:t>xiÉ</w:t>
-            </w:r>
-            <w:proofErr w:type="spellEnd"/>
-            <w:r>
-              <w:rPr>
-                <w:rFonts w:ascii="BRH Devanagari Extra" w:hAnsi="BRH Devanagari Extra" w:cs="BRH Devanagari Extra"/>
-                <w:color w:val="000000"/>
-                <w:sz w:val="40"/>
-                <w:szCs w:val="40"/>
-              </w:rPr>
-              <w:t>×</w:t>
+            <w:r>
+              <w:rPr>
+                <w:rFonts w:ascii="BRH Devanagari Extra" w:hAnsi="BRH Devanagari Extra" w:cs="BRH Devanagari Extra"/>
+                <w:color w:val="000000"/>
+                <w:sz w:val="40"/>
+                <w:szCs w:val="40"/>
+              </w:rPr>
+              <w:t>xiÉ×</w:t>
             </w:r>
             <w:r>
               <w:rPr>
@@ -7609,7 +7594,6 @@
               </w:rPr>
               <w:t>–</w:t>
             </w:r>
-            <w:proofErr w:type="spellStart"/>
             <w:r>
               <w:rPr>
                 <w:rFonts w:ascii="BRH Devanagari Extra" w:hAnsi="BRH Devanagari Extra" w:cs="BRH Devanagari Extra"/>
@@ -7619,7 +7603,6 @@
               </w:rPr>
               <w:t>iÉ</w:t>
             </w:r>
-            <w:proofErr w:type="spellEnd"/>
             <w:r>
               <w:rPr>
                 <w:rFonts w:ascii="BRH Malayalam Extra" w:hAnsi="BRH Malayalam Extra" w:cs="BRH Devanagari Extra"/>
@@ -7830,7 +7813,6 @@
               </w:rPr>
               <w:t>–</w:t>
             </w:r>
-            <w:proofErr w:type="spellStart"/>
             <w:r>
               <w:rPr>
                 <w:rFonts w:ascii="BRH Devanagari Extra" w:hAnsi="BRH Devanagari Extra" w:cs="BRH Devanagari Extra"/>
@@ -7841,7 +7823,6 @@
               </w:rPr>
               <w:t>uÉ</w:t>
             </w:r>
-            <w:proofErr w:type="spellEnd"/>
             <w:r>
               <w:rPr>
                 <w:rFonts w:ascii="BRH Malayalam Extra" w:hAnsi="BRH Malayalam Extra" w:cs="BRH Devanagari Extra"/>
@@ -7898,25 +7879,14 @@
                 <w:szCs w:val="40"/>
               </w:rPr>
             </w:pPr>
-            <w:proofErr w:type="spellStart"/>
-            <w:r>
-              <w:rPr>
-                <w:rFonts w:ascii="BRH Devanagari Extra" w:hAnsi="BRH Devanagari Extra" w:cs="BRH Devanagari Extra"/>
-                <w:color w:val="000000"/>
-                <w:sz w:val="40"/>
-                <w:szCs w:val="40"/>
-              </w:rPr>
-              <w:t>xiÉ</w:t>
-            </w:r>
-            <w:proofErr w:type="spellEnd"/>
-            <w:r>
-              <w:rPr>
-                <w:rFonts w:ascii="BRH Devanagari Extra" w:hAnsi="BRH Devanagari Extra" w:cs="BRH Devanagari Extra"/>
-                <w:color w:val="000000"/>
-                <w:sz w:val="40"/>
-                <w:szCs w:val="40"/>
-              </w:rPr>
-              <w:t>×</w:t>
+            <w:r>
+              <w:rPr>
+                <w:rFonts w:ascii="BRH Devanagari Extra" w:hAnsi="BRH Devanagari Extra" w:cs="BRH Devanagari Extra"/>
+                <w:color w:val="000000"/>
+                <w:sz w:val="40"/>
+                <w:szCs w:val="40"/>
+              </w:rPr>
+              <w:t>xiÉ×</w:t>
             </w:r>
             <w:r>
               <w:rPr>
@@ -7949,7 +7919,6 @@
               </w:rPr>
               <w:t>–</w:t>
             </w:r>
-            <w:proofErr w:type="spellStart"/>
             <w:r>
               <w:rPr>
                 <w:rFonts w:ascii="BRH Devanagari Extra" w:hAnsi="BRH Devanagari Extra" w:cs="BRH Devanagari Extra"/>
@@ -7959,7 +7928,6 @@
               </w:rPr>
               <w:t>iÉ</w:t>
             </w:r>
-            <w:proofErr w:type="spellEnd"/>
             <w:r>
               <w:rPr>
                 <w:rFonts w:ascii="BRH Malayalam Extra" w:hAnsi="BRH Malayalam Extra" w:cs="BRH Devanagari Extra"/>
@@ -8600,37 +8568,15 @@
               </w:rPr>
               <w:t>–</w:t>
             </w:r>
-            <w:proofErr w:type="spellStart"/>
-            <w:r>
-              <w:rPr>
-                <w:rFonts w:ascii="BRH Devanagari Extra" w:hAnsi="BRH Devanagari Extra" w:cs="BRH Devanagari Extra"/>
-                <w:color w:val="000000"/>
-                <w:sz w:val="40"/>
-                <w:szCs w:val="40"/>
-              </w:rPr>
-              <w:t>qÉç</w:t>
-            </w:r>
-            <w:proofErr w:type="spellEnd"/>
-            <w:r>
-              <w:rPr>
-                <w:rFonts w:ascii="BRH Devanagari Extra" w:hAnsi="BRH Devanagari Extra" w:cs="BRH Devanagari Extra"/>
-                <w:color w:val="000000"/>
-                <w:sz w:val="40"/>
-                <w:szCs w:val="40"/>
-              </w:rPr>
-              <w:t xml:space="preserve"> </w:t>
-            </w:r>
-            <w:proofErr w:type="spellStart"/>
-            <w:r>
-              <w:rPr>
-                <w:rFonts w:ascii="BRH Devanagari Extra" w:hAnsi="BRH Devanagari Extra" w:cs="BRH Devanagari Extra"/>
-                <w:color w:val="000000"/>
-                <w:sz w:val="40"/>
-                <w:szCs w:val="40"/>
-              </w:rPr>
-              <w:t>cÉ</w:t>
-            </w:r>
-            <w:proofErr w:type="spellEnd"/>
+            <w:r>
+              <w:rPr>
+                <w:rFonts w:ascii="BRH Devanagari Extra" w:hAnsi="BRH Devanagari Extra" w:cs="BRH Devanagari Extra"/>
+                <w:color w:val="000000"/>
+                <w:sz w:val="40"/>
+                <w:szCs w:val="40"/>
+              </w:rPr>
+              <w:t>qÉç cÉ</w:t>
+            </w:r>
             <w:r>
               <w:rPr>
                 <w:rFonts w:ascii="BRH Malayalam Extra" w:hAnsi="BRH Malayalam Extra" w:cs="BRH Devanagari Extra"/>
@@ -8943,19 +8889,8 @@
                 <w:sz w:val="40"/>
                 <w:szCs w:val="40"/>
               </w:rPr>
-              <w:t xml:space="preserve"> </w:t>
-            </w:r>
-            <w:proofErr w:type="spellStart"/>
-            <w:r>
-              <w:rPr>
-                <w:rFonts w:ascii="BRH Devanagari Extra" w:hAnsi="BRH Devanagari Extra" w:cs="BRH Devanagari Extra"/>
-                <w:color w:val="000000"/>
-                <w:sz w:val="40"/>
-                <w:szCs w:val="40"/>
-              </w:rPr>
-              <w:t>cÉ</w:t>
-            </w:r>
-            <w:proofErr w:type="spellEnd"/>
+              <w:t xml:space="preserve"> cÉ</w:t>
+            </w:r>
             <w:r>
               <w:rPr>
                 <w:rFonts w:ascii="BRH Malayalam Extra" w:hAnsi="BRH Malayalam Extra" w:cs="BRH Devanagari Extra"/>
@@ -9031,7 +8966,6 @@
           <w:szCs w:val="32"/>
           <w:u w:val="single"/>
         </w:rPr>
-        <w:lastRenderedPageBreak/>
         <w:t xml:space="preserve">TS </w:t>
       </w:r>
       <w:r>
@@ -9462,7 +9396,6 @@
                 <w:lang w:bidi="ta-IN"/>
               </w:rPr>
             </w:pPr>
-            <w:proofErr w:type="spellStart"/>
             <w:r>
               <w:rPr>
                 <w:rFonts w:ascii="BRH Devanagari Extra" w:hAnsi="BRH Devanagari Extra" w:cs="BRH Devanagari Extra"/>
@@ -9472,7 +9405,6 @@
               </w:rPr>
               <w:t>Lå</w:t>
             </w:r>
-            <w:proofErr w:type="spellEnd"/>
             <w:r>
               <w:rPr>
                 <w:rFonts w:ascii="BRH Malayalam Extra" w:hAnsi="BRH Malayalam Extra" w:cs="BRH Devanagari Extra"/>
@@ -9514,25 +9446,14 @@
               </w:rPr>
               <w:t>–</w:t>
             </w:r>
-            <w:proofErr w:type="spellStart"/>
-            <w:r>
-              <w:rPr>
-                <w:rFonts w:ascii="BRH Devanagari Extra" w:hAnsi="BRH Devanagari Extra" w:cs="BRH Devanagari Extra"/>
-                <w:color w:val="000000"/>
-                <w:sz w:val="40"/>
-                <w:szCs w:val="40"/>
-              </w:rPr>
-              <w:t>alÉ</w:t>
-            </w:r>
-            <w:proofErr w:type="spellEnd"/>
-            <w:r>
-              <w:rPr>
-                <w:rFonts w:ascii="BRH Devanagari Extra" w:hAnsi="BRH Devanagari Extra" w:cs="BRH Devanagari Extra"/>
-                <w:color w:val="000000"/>
-                <w:sz w:val="40"/>
-                <w:szCs w:val="40"/>
-              </w:rPr>
-              <w:t xml:space="preserve"> </w:t>
+            <w:r>
+              <w:rPr>
+                <w:rFonts w:ascii="BRH Devanagari Extra" w:hAnsi="BRH Devanagari Extra" w:cs="BRH Devanagari Extra"/>
+                <w:color w:val="000000"/>
+                <w:sz w:val="40"/>
+                <w:szCs w:val="40"/>
+              </w:rPr>
+              <w:t xml:space="preserve">alÉ </w:t>
             </w:r>
             <w:proofErr w:type="spellStart"/>
             <w:r>
@@ -9646,7 +9567,6 @@
                 <w:lang w:bidi="ta-IN"/>
               </w:rPr>
             </w:pPr>
-            <w:proofErr w:type="spellStart"/>
             <w:r>
               <w:rPr>
                 <w:rFonts w:ascii="BRH Devanagari Extra" w:hAnsi="BRH Devanagari Extra" w:cs="BRH Devanagari Extra"/>
@@ -9656,7 +9576,6 @@
               </w:rPr>
               <w:t>Lå</w:t>
             </w:r>
-            <w:proofErr w:type="spellEnd"/>
             <w:r>
               <w:rPr>
                 <w:rFonts w:ascii="BRH Malayalam Extra" w:hAnsi="BRH Malayalam Extra" w:cs="BRH Devanagari Extra"/>
@@ -10225,6 +10144,7 @@
                 <w:sz w:val="28"/>
                 <w:szCs w:val="28"/>
               </w:rPr>
+              <w:lastRenderedPageBreak/>
               <w:t>TS 2.2.6.4</w:t>
             </w:r>
           </w:p>
@@ -10306,7 +10226,6 @@
                 <w:szCs w:val="40"/>
               </w:rPr>
             </w:pPr>
-            <w:proofErr w:type="spellStart"/>
             <w:r>
               <w:rPr>
                 <w:rFonts w:ascii="BRH Devanagari Extra" w:hAnsi="BRH Devanagari Extra" w:cs="BRH Devanagari Extra"/>
@@ -10316,7 +10235,6 @@
               </w:rPr>
               <w:t>ÌlÉ</w:t>
             </w:r>
-            <w:proofErr w:type="spellEnd"/>
             <w:r>
               <w:rPr>
                 <w:rFonts w:ascii="BRH Malayalam Extra" w:hAnsi="BRH Malayalam Extra" w:cs="BRH Devanagari Extra"/>
@@ -10405,7 +10323,6 @@
                 <w:cs/>
               </w:rPr>
             </w:pPr>
-            <w:proofErr w:type="spellStart"/>
             <w:r>
               <w:rPr>
                 <w:rFonts w:ascii="BRH Devanagari Extra" w:hAnsi="BRH Devanagari Extra" w:cs="BRH Devanagari Extra"/>
@@ -10415,7 +10332,6 @@
               </w:rPr>
               <w:t>ÌlÉ</w:t>
             </w:r>
-            <w:proofErr w:type="spellEnd"/>
             <w:r>
               <w:rPr>
                 <w:rFonts w:ascii="BRH Malayalam Extra" w:hAnsi="BRH Malayalam Extra" w:cs="BRH Devanagari Extra"/>
@@ -10535,7 +10451,6 @@
                 <w:szCs w:val="40"/>
               </w:rPr>
             </w:pPr>
-            <w:proofErr w:type="spellStart"/>
             <w:r>
               <w:rPr>
                 <w:rFonts w:ascii="BRH Devanagari Extra" w:hAnsi="BRH Devanagari Extra" w:cs="BRH Devanagari Extra"/>
@@ -10545,7 +10460,6 @@
               </w:rPr>
               <w:t>ÌlÉ</w:t>
             </w:r>
-            <w:proofErr w:type="spellEnd"/>
             <w:r>
               <w:rPr>
                 <w:rFonts w:ascii="BRH Malayalam Extra" w:hAnsi="BRH Malayalam Extra" w:cs="BRH Devanagari Extra"/>
@@ -10629,7 +10543,6 @@
                 <w:cs/>
               </w:rPr>
             </w:pPr>
-            <w:proofErr w:type="spellStart"/>
             <w:r>
               <w:rPr>
                 <w:rFonts w:ascii="BRH Devanagari Extra" w:hAnsi="BRH Devanagari Extra" w:cs="BRH Devanagari Extra"/>
@@ -10639,7 +10552,6 @@
               </w:rPr>
               <w:t>ÌlÉ</w:t>
             </w:r>
-            <w:proofErr w:type="spellEnd"/>
             <w:r>
               <w:rPr>
                 <w:rFonts w:ascii="BRH Malayalam Extra" w:hAnsi="BRH Malayalam Extra" w:cs="BRH Devanagari Extra"/>
@@ -11639,7 +11551,6 @@
                 <w:sz w:val="28"/>
                 <w:szCs w:val="28"/>
               </w:rPr>
-              <w:lastRenderedPageBreak/>
               <w:t>TS 2.2.9.5</w:t>
             </w:r>
           </w:p>
@@ -11750,37 +11661,16 @@
                 <w:szCs w:val="40"/>
                 <w:highlight w:val="yellow"/>
               </w:rPr>
-              <w:t>¸</w:t>
-            </w:r>
-            <w:proofErr w:type="spellStart"/>
-            <w:r>
-              <w:rPr>
-                <w:rFonts w:ascii="BRH Devanagari Extra" w:hAnsi="BRH Devanagari Extra" w:cs="BRH Devanagari Extra"/>
-                <w:color w:val="000000"/>
-                <w:sz w:val="40"/>
-                <w:szCs w:val="40"/>
-                <w:highlight w:val="yellow"/>
-              </w:rPr>
-              <w:t>É</w:t>
-            </w:r>
-            <w:r>
-              <w:rPr>
-                <w:rFonts w:ascii="BRH Devanagari Extra" w:hAnsi="BRH Devanagari Extra" w:cs="BRH Devanagari Extra"/>
-                <w:color w:val="000000"/>
-                <w:sz w:val="40"/>
-                <w:szCs w:val="40"/>
-              </w:rPr>
-              <w:t>¤ÉþUÉ</w:t>
-            </w:r>
-            <w:proofErr w:type="spellEnd"/>
-            <w:r>
-              <w:rPr>
-                <w:rFonts w:ascii="BRH Devanagari Extra" w:hAnsi="BRH Devanagari Extra" w:cs="BRH Devanagari Extra"/>
-                <w:color w:val="000000"/>
-                <w:sz w:val="40"/>
-                <w:szCs w:val="40"/>
-              </w:rPr>
-              <w:t xml:space="preserve"> | A</w:t>
+              <w:t>¸É</w:t>
+            </w:r>
+            <w:r>
+              <w:rPr>
+                <w:rFonts w:ascii="BRH Devanagari Extra" w:hAnsi="BRH Devanagari Extra" w:cs="BRH Devanagari Extra"/>
+                <w:color w:val="000000"/>
+                <w:sz w:val="40"/>
+                <w:szCs w:val="40"/>
+              </w:rPr>
+              <w:t>¤ÉþUÉ | A</w:t>
             </w:r>
             <w:r>
               <w:rPr>
@@ -12504,25 +12394,14 @@
               </w:rPr>
               <w:t>–</w:t>
             </w:r>
-            <w:proofErr w:type="spellStart"/>
-            <w:r>
-              <w:rPr>
-                <w:rFonts w:ascii="BRH Devanagari Extra" w:hAnsi="BRH Devanagari Extra" w:cs="BRH Devanagari Extra"/>
-                <w:color w:val="000000"/>
-                <w:sz w:val="40"/>
-                <w:szCs w:val="40"/>
-              </w:rPr>
-              <w:t>Uç</w:t>
-            </w:r>
-            <w:proofErr w:type="spellEnd"/>
-            <w:r>
-              <w:rPr>
-                <w:rFonts w:ascii="BRH Devanagari Extra" w:hAnsi="BRH Devanagari Extra" w:cs="BRH Devanagari Extra"/>
-                <w:color w:val="000000"/>
-                <w:sz w:val="40"/>
-                <w:szCs w:val="40"/>
-              </w:rPr>
-              <w:t xml:space="preserve"> </w:t>
+            <w:r>
+              <w:rPr>
+                <w:rFonts w:ascii="BRH Devanagari Extra" w:hAnsi="BRH Devanagari Extra" w:cs="BRH Devanagari Extra"/>
+                <w:color w:val="000000"/>
+                <w:sz w:val="40"/>
+                <w:szCs w:val="40"/>
+              </w:rPr>
+              <w:t xml:space="preserve">Uç </w:t>
             </w:r>
             <w:proofErr w:type="spellStart"/>
             <w:r>
@@ -12826,25 +12705,14 @@
               </w:rPr>
               <w:t>–</w:t>
             </w:r>
-            <w:proofErr w:type="spellStart"/>
-            <w:r>
-              <w:rPr>
-                <w:rFonts w:ascii="BRH Devanagari Extra" w:hAnsi="BRH Devanagari Extra" w:cs="BRH Devanagari Extra"/>
-                <w:color w:val="000000"/>
-                <w:sz w:val="40"/>
-                <w:szCs w:val="40"/>
-              </w:rPr>
-              <w:t>Uç</w:t>
-            </w:r>
-            <w:proofErr w:type="spellEnd"/>
-            <w:r>
-              <w:rPr>
-                <w:rFonts w:ascii="BRH Devanagari Extra" w:hAnsi="BRH Devanagari Extra" w:cs="BRH Devanagari Extra"/>
-                <w:color w:val="000000"/>
-                <w:sz w:val="40"/>
-                <w:szCs w:val="40"/>
-              </w:rPr>
-              <w:t xml:space="preserve"> </w:t>
+            <w:r>
+              <w:rPr>
+                <w:rFonts w:ascii="BRH Devanagari Extra" w:hAnsi="BRH Devanagari Extra" w:cs="BRH Devanagari Extra"/>
+                <w:color w:val="000000"/>
+                <w:sz w:val="40"/>
+                <w:szCs w:val="40"/>
+              </w:rPr>
+              <w:t xml:space="preserve">Uç </w:t>
             </w:r>
             <w:proofErr w:type="spellStart"/>
             <w:r>
@@ -13087,6 +12955,7 @@
                 <w:sz w:val="28"/>
                 <w:szCs w:val="28"/>
               </w:rPr>
+              <w:lastRenderedPageBreak/>
               <w:t>TS 2.2.10.5</w:t>
             </w:r>
           </w:p>
@@ -13302,25 +13171,14 @@
               </w:rPr>
               <w:t>–</w:t>
             </w:r>
-            <w:proofErr w:type="spellStart"/>
-            <w:r>
-              <w:rPr>
-                <w:rFonts w:ascii="BRH Devanagari Extra" w:hAnsi="BRH Devanagari Extra" w:cs="BRH Devanagari Extra"/>
-                <w:color w:val="000000"/>
-                <w:sz w:val="40"/>
-                <w:szCs w:val="40"/>
-              </w:rPr>
-              <w:t>iÉç</w:t>
-            </w:r>
-            <w:proofErr w:type="spellEnd"/>
-            <w:r>
-              <w:rPr>
-                <w:rFonts w:ascii="BRH Devanagari Extra" w:hAnsi="BRH Devanagari Extra" w:cs="BRH Devanagari Extra"/>
-                <w:color w:val="000000"/>
-                <w:sz w:val="40"/>
-                <w:szCs w:val="40"/>
-              </w:rPr>
-              <w:t xml:space="preserve"> |</w:t>
+            <w:r>
+              <w:rPr>
+                <w:rFonts w:ascii="BRH Devanagari Extra" w:hAnsi="BRH Devanagari Extra" w:cs="BRH Devanagari Extra"/>
+                <w:color w:val="000000"/>
+                <w:sz w:val="40"/>
+                <w:szCs w:val="40"/>
+              </w:rPr>
+              <w:t>iÉç |</w:t>
             </w:r>
           </w:p>
         </w:tc>
@@ -13483,25 +13341,14 @@
               </w:rPr>
               <w:t>–</w:t>
             </w:r>
-            <w:proofErr w:type="spellStart"/>
-            <w:r>
-              <w:rPr>
-                <w:rFonts w:ascii="BRH Devanagari Extra" w:hAnsi="BRH Devanagari Extra" w:cs="BRH Devanagari Extra"/>
-                <w:color w:val="000000"/>
-                <w:sz w:val="40"/>
-                <w:szCs w:val="40"/>
-              </w:rPr>
-              <w:t>iÉç</w:t>
-            </w:r>
-            <w:proofErr w:type="spellEnd"/>
-            <w:r>
-              <w:rPr>
-                <w:rFonts w:ascii="BRH Devanagari Extra" w:hAnsi="BRH Devanagari Extra" w:cs="BRH Devanagari Extra"/>
-                <w:color w:val="000000"/>
-                <w:sz w:val="40"/>
-                <w:szCs w:val="40"/>
-              </w:rPr>
-              <w:t xml:space="preserve"> |</w:t>
+            <w:r>
+              <w:rPr>
+                <w:rFonts w:ascii="BRH Devanagari Extra" w:hAnsi="BRH Devanagari Extra" w:cs="BRH Devanagari Extra"/>
+                <w:color w:val="000000"/>
+                <w:sz w:val="40"/>
+                <w:szCs w:val="40"/>
+              </w:rPr>
+              <w:t>iÉç |</w:t>
             </w:r>
           </w:p>
         </w:tc>
@@ -14060,7 +13907,6 @@
                 <w:szCs w:val="40"/>
               </w:rPr>
             </w:pPr>
-            <w:proofErr w:type="spellStart"/>
             <w:r>
               <w:rPr>
                 <w:rFonts w:ascii="BRH Devanagari Extra" w:hAnsi="BRH Devanagari Extra" w:cs="BRH Devanagari Extra"/>
@@ -14070,18 +13916,16 @@
               </w:rPr>
               <w:t>pÉ</w:t>
             </w:r>
-            <w:proofErr w:type="spellEnd"/>
-            <w:r>
-              <w:rPr>
-                <w:rFonts w:ascii="BRH Malayalam Extra" w:hAnsi="BRH Malayalam Extra" w:cs="BRH Devanagari Extra"/>
-                <w:b/>
-                <w:color w:val="000000"/>
-                <w:sz w:val="32"/>
-                <w:szCs w:val="40"/>
-              </w:rPr>
-              <w:t>–</w:t>
-            </w:r>
-            <w:proofErr w:type="spellStart"/>
+            <w:r>
+              <w:rPr>
+                <w:rFonts w:ascii="BRH Malayalam Extra" w:hAnsi="BRH Malayalam Extra" w:cs="BRH Devanagari Extra"/>
+                <w:b/>
+                <w:color w:val="000000"/>
+                <w:sz w:val="32"/>
+                <w:szCs w:val="40"/>
+              </w:rPr>
+              <w:t>–</w:t>
+            </w:r>
             <w:r>
               <w:rPr>
                 <w:rFonts w:ascii="BRH Devanagari Extra" w:hAnsi="BRH Devanagari Extra" w:cs="BRH Devanagari Extra"/>
@@ -14091,7 +13935,6 @@
               </w:rPr>
               <w:t>uÉ</w:t>
             </w:r>
-            <w:proofErr w:type="spellEnd"/>
             <w:r>
               <w:rPr>
                 <w:rFonts w:ascii="BRH Malayalam Extra" w:hAnsi="BRH Malayalam Extra" w:cs="BRH Devanagari Extra"/>
@@ -14143,19 +13986,8 @@
                 <w:sz w:val="40"/>
                 <w:szCs w:val="40"/>
               </w:rPr>
-              <w:t xml:space="preserve"> | </w:t>
-            </w:r>
-            <w:proofErr w:type="spellStart"/>
-            <w:r>
-              <w:rPr>
-                <w:rFonts w:ascii="BRH Devanagari Extra" w:hAnsi="BRH Devanagari Extra" w:cs="BRH Devanagari Extra"/>
-                <w:color w:val="000000"/>
-                <w:sz w:val="40"/>
-                <w:szCs w:val="40"/>
-              </w:rPr>
-              <w:t>Lå</w:t>
-            </w:r>
-            <w:proofErr w:type="spellEnd"/>
+              <w:t xml:space="preserve"> | Lå</w:t>
+            </w:r>
             <w:r>
               <w:rPr>
                 <w:rFonts w:ascii="BRH Malayalam Extra" w:hAnsi="BRH Malayalam Extra" w:cs="BRH Devanagari Extra"/>
@@ -14229,7 +14061,6 @@
                 <w:szCs w:val="40"/>
               </w:rPr>
             </w:pPr>
-            <w:proofErr w:type="spellStart"/>
             <w:r>
               <w:rPr>
                 <w:rFonts w:ascii="BRH Devanagari Extra" w:hAnsi="BRH Devanagari Extra" w:cs="BRH Devanagari Extra"/>
@@ -14239,18 +14070,16 @@
               </w:rPr>
               <w:t>pÉ</w:t>
             </w:r>
-            <w:proofErr w:type="spellEnd"/>
-            <w:r>
-              <w:rPr>
-                <w:rFonts w:ascii="BRH Malayalam Extra" w:hAnsi="BRH Malayalam Extra" w:cs="BRH Devanagari Extra"/>
-                <w:b/>
-                <w:color w:val="000000"/>
-                <w:sz w:val="32"/>
-                <w:szCs w:val="40"/>
-              </w:rPr>
-              <w:t>–</w:t>
-            </w:r>
-            <w:proofErr w:type="spellStart"/>
+            <w:r>
+              <w:rPr>
+                <w:rFonts w:ascii="BRH Malayalam Extra" w:hAnsi="BRH Malayalam Extra" w:cs="BRH Devanagari Extra"/>
+                <w:b/>
+                <w:color w:val="000000"/>
+                <w:sz w:val="32"/>
+                <w:szCs w:val="40"/>
+              </w:rPr>
+              <w:t>–</w:t>
+            </w:r>
             <w:r>
               <w:rPr>
                 <w:rFonts w:ascii="BRH Devanagari Extra" w:hAnsi="BRH Devanagari Extra" w:cs="BRH Devanagari Extra"/>
@@ -14260,7 +14089,6 @@
               </w:rPr>
               <w:t>uÉ</w:t>
             </w:r>
-            <w:proofErr w:type="spellEnd"/>
             <w:r>
               <w:rPr>
                 <w:rFonts w:ascii="BRH Malayalam Extra" w:hAnsi="BRH Malayalam Extra" w:cs="BRH Devanagari Extra"/>
@@ -14320,19 +14148,8 @@
                 <w:sz w:val="40"/>
                 <w:szCs w:val="40"/>
               </w:rPr>
-              <w:t xml:space="preserve"> | </w:t>
-            </w:r>
-            <w:proofErr w:type="spellStart"/>
-            <w:r>
-              <w:rPr>
-                <w:rFonts w:ascii="BRH Devanagari Extra" w:hAnsi="BRH Devanagari Extra" w:cs="BRH Devanagari Extra"/>
-                <w:color w:val="000000"/>
-                <w:sz w:val="40"/>
-                <w:szCs w:val="40"/>
-              </w:rPr>
-              <w:t>Lå</w:t>
-            </w:r>
-            <w:proofErr w:type="spellEnd"/>
+              <w:t xml:space="preserve"> | Lå</w:t>
+            </w:r>
             <w:r>
               <w:rPr>
                 <w:rFonts w:ascii="BRH Malayalam Extra" w:hAnsi="BRH Malayalam Extra" w:cs="BRH Devanagari Extra"/>
@@ -14422,7 +14239,6 @@
                 <w:sz w:val="28"/>
                 <w:szCs w:val="28"/>
               </w:rPr>
-              <w:lastRenderedPageBreak/>
               <w:t>TS 2.2.11.4</w:t>
             </w:r>
           </w:p>
@@ -15526,19 +15342,8 @@
                 <w:sz w:val="40"/>
                 <w:szCs w:val="40"/>
               </w:rPr>
-              <w:t xml:space="preserve"> </w:t>
-            </w:r>
-            <w:proofErr w:type="spellStart"/>
-            <w:r>
-              <w:rPr>
-                <w:rFonts w:ascii="BRH Devanagari Extra" w:hAnsi="BRH Devanagari Extra" w:cs="BRH Devanagari Extra"/>
-                <w:color w:val="000000"/>
-                <w:sz w:val="40"/>
-                <w:szCs w:val="40"/>
-              </w:rPr>
-              <w:t>cÉ</w:t>
-            </w:r>
-            <w:proofErr w:type="spellEnd"/>
+              <w:t xml:space="preserve"> cÉ</w:t>
+            </w:r>
             <w:r>
               <w:rPr>
                 <w:rFonts w:ascii="BRH Malayalam Extra" w:hAnsi="BRH Malayalam Extra" w:cs="BRH Devanagari Extra"/>
@@ -15592,6 +15397,7 @@
                 <w:sz w:val="40"/>
                 <w:szCs w:val="40"/>
               </w:rPr>
+              <w:lastRenderedPageBreak/>
               <w:t>Â</w:t>
             </w:r>
             <w:r>
@@ -15692,19 +15498,8 @@
                 <w:sz w:val="40"/>
                 <w:szCs w:val="40"/>
               </w:rPr>
-              <w:t xml:space="preserve"> - </w:t>
-            </w:r>
-            <w:proofErr w:type="spellStart"/>
-            <w:r>
-              <w:rPr>
-                <w:rFonts w:ascii="BRH Devanagari Extra" w:hAnsi="BRH Devanagari Extra" w:cs="BRH Devanagari Extra"/>
-                <w:color w:val="000000"/>
-                <w:sz w:val="40"/>
-                <w:szCs w:val="40"/>
-              </w:rPr>
-              <w:t>uÉ</w:t>
-            </w:r>
-            <w:proofErr w:type="spellEnd"/>
+              <w:t xml:space="preserve"> - uÉ</w:t>
+            </w:r>
             <w:r>
               <w:rPr>
                 <w:rFonts w:ascii="BRH Malayalam Extra" w:hAnsi="BRH Malayalam Extra" w:cs="BRH Devanagari Extra"/>
@@ -15778,6 +15573,7 @@
                 <w:sz w:val="40"/>
                 <w:szCs w:val="40"/>
               </w:rPr>
+              <w:lastRenderedPageBreak/>
               <w:t>Â</w:t>
             </w:r>
             <w:r>
@@ -15808,6 +15604,108 @@
                 <w:sz w:val="40"/>
                 <w:szCs w:val="40"/>
               </w:rPr>
+              <w:t xml:space="preserve"> cÉ</w:t>
+            </w:r>
+            <w:r>
+              <w:rPr>
+                <w:rFonts w:ascii="BRH Malayalam Extra" w:hAnsi="BRH Malayalam Extra" w:cs="BRH Devanagari Extra"/>
+                <w:b/>
+                <w:color w:val="000000"/>
+                <w:sz w:val="32"/>
+                <w:szCs w:val="40"/>
+              </w:rPr>
+              <w:t>–</w:t>
+            </w:r>
+            <w:proofErr w:type="spellStart"/>
+            <w:r>
+              <w:rPr>
+                <w:rFonts w:ascii="BRH Devanagari Extra" w:hAnsi="BRH Devanagari Extra" w:cs="BRH Devanagari Extra"/>
+                <w:color w:val="000000"/>
+                <w:sz w:val="40"/>
+                <w:szCs w:val="40"/>
+              </w:rPr>
+              <w:t>ÂqÉç</w:t>
+            </w:r>
+            <w:proofErr w:type="spellEnd"/>
+            <w:r>
+              <w:rPr>
+                <w:rFonts w:ascii="BRH Devanagari Extra" w:hAnsi="BRH Devanagari Extra" w:cs="BRH Devanagari Extra"/>
+                <w:color w:val="000000"/>
+                <w:sz w:val="40"/>
+                <w:szCs w:val="40"/>
+              </w:rPr>
+              <w:t xml:space="preserve"> | </w:t>
+            </w:r>
+          </w:p>
+          <w:p>
+            <w:pPr>
+              <w:spacing w:before="0" w:line="240" w:lineRule="auto"/>
+              <w:rPr>
+                <w:rFonts w:ascii="BRH Malayalam Extra" w:hAnsi="BRH Malayalam Extra" w:cs="BRH Malayalam Extra"/>
+                <w:color w:val="000000"/>
+                <w:sz w:val="40"/>
+                <w:szCs w:val="40"/>
+                <w:cs/>
+              </w:rPr>
+            </w:pPr>
+            <w:r>
+              <w:rPr>
+                <w:rFonts w:ascii="BRH Devanagari Extra" w:hAnsi="BRH Devanagari Extra" w:cs="BRH Devanagari Extra"/>
+                <w:color w:val="000000"/>
+                <w:sz w:val="40"/>
+                <w:szCs w:val="40"/>
+              </w:rPr>
+              <w:lastRenderedPageBreak/>
+              <w:t>Â</w:t>
+            </w:r>
+            <w:r>
+              <w:rPr>
+                <w:rFonts w:ascii="BRH Malayalam Extra" w:hAnsi="BRH Malayalam Extra" w:cs="BRH Devanagari Extra"/>
+                <w:b/>
+                <w:color w:val="000000"/>
+                <w:sz w:val="32"/>
+                <w:szCs w:val="40"/>
+              </w:rPr>
+              <w:t>–</w:t>
+            </w:r>
+            <w:proofErr w:type="spellStart"/>
+            <w:r>
+              <w:rPr>
+                <w:rFonts w:ascii="BRH Devanagari Extra" w:hAnsi="BRH Devanagari Extra" w:cs="BRH Devanagari Extra"/>
+                <w:color w:val="000000"/>
+                <w:sz w:val="40"/>
+                <w:szCs w:val="40"/>
+                <w:highlight w:val="green"/>
+              </w:rPr>
+              <w:t>SìuÉ</w:t>
+            </w:r>
+            <w:r>
+              <w:rPr>
+                <w:rFonts w:ascii="BRH Devanagari Extra" w:hAnsi="BRH Devanagari Extra" w:cs="BRH Devanagari Extra"/>
+                <w:color w:val="000000"/>
+                <w:sz w:val="40"/>
+                <w:szCs w:val="40"/>
+              </w:rPr>
+              <w:t>þiÉ</w:t>
+            </w:r>
+            <w:proofErr w:type="spellEnd"/>
+            <w:r>
+              <w:rPr>
+                <w:rFonts w:ascii="BRH Malayalam Extra" w:hAnsi="BRH Malayalam Extra" w:cs="BRH Devanagari Extra"/>
+                <w:b/>
+                <w:color w:val="000000"/>
+                <w:sz w:val="32"/>
+                <w:szCs w:val="40"/>
+              </w:rPr>
+              <w:t>–</w:t>
+            </w:r>
+            <w:r>
+              <w:rPr>
+                <w:rFonts w:ascii="BRH Devanagari Extra" w:hAnsi="BRH Devanagari Extra" w:cs="BRH Devanagari Extra"/>
+                <w:color w:val="000000"/>
+                <w:sz w:val="40"/>
+                <w:szCs w:val="40"/>
+              </w:rPr>
               <w:t xml:space="preserve"> </w:t>
             </w:r>
             <w:proofErr w:type="spellStart"/>
@@ -15818,118 +15716,6 @@
                 <w:sz w:val="40"/>
                 <w:szCs w:val="40"/>
               </w:rPr>
-              <w:t>cÉ</w:t>
-            </w:r>
-            <w:proofErr w:type="spellEnd"/>
-            <w:r>
-              <w:rPr>
-                <w:rFonts w:ascii="BRH Malayalam Extra" w:hAnsi="BRH Malayalam Extra" w:cs="BRH Devanagari Extra"/>
-                <w:b/>
-                <w:color w:val="000000"/>
-                <w:sz w:val="32"/>
-                <w:szCs w:val="40"/>
-              </w:rPr>
-              <w:t>–</w:t>
-            </w:r>
-            <w:proofErr w:type="spellStart"/>
-            <w:r>
-              <w:rPr>
-                <w:rFonts w:ascii="BRH Devanagari Extra" w:hAnsi="BRH Devanagari Extra" w:cs="BRH Devanagari Extra"/>
-                <w:color w:val="000000"/>
-                <w:sz w:val="40"/>
-                <w:szCs w:val="40"/>
-              </w:rPr>
-              <w:t>ÂqÉç</w:t>
-            </w:r>
-            <w:proofErr w:type="spellEnd"/>
-            <w:r>
-              <w:rPr>
-                <w:rFonts w:ascii="BRH Devanagari Extra" w:hAnsi="BRH Devanagari Extra" w:cs="BRH Devanagari Extra"/>
-                <w:color w:val="000000"/>
-                <w:sz w:val="40"/>
-                <w:szCs w:val="40"/>
-              </w:rPr>
-              <w:t xml:space="preserve"> | </w:t>
-            </w:r>
-          </w:p>
-          <w:p>
-            <w:pPr>
-              <w:spacing w:before="0" w:line="240" w:lineRule="auto"/>
-              <w:rPr>
-                <w:rFonts w:ascii="BRH Malayalam Extra" w:hAnsi="BRH Malayalam Extra" w:cs="BRH Malayalam Extra"/>
-                <w:color w:val="000000"/>
-                <w:sz w:val="40"/>
-                <w:szCs w:val="40"/>
-                <w:cs/>
-              </w:rPr>
-            </w:pPr>
-            <w:r>
-              <w:rPr>
-                <w:rFonts w:ascii="BRH Devanagari Extra" w:hAnsi="BRH Devanagari Extra" w:cs="BRH Devanagari Extra"/>
-                <w:color w:val="000000"/>
-                <w:sz w:val="40"/>
-                <w:szCs w:val="40"/>
-              </w:rPr>
-              <w:t>Â</w:t>
-            </w:r>
-            <w:r>
-              <w:rPr>
-                <w:rFonts w:ascii="BRH Malayalam Extra" w:hAnsi="BRH Malayalam Extra" w:cs="BRH Devanagari Extra"/>
-                <w:b/>
-                <w:color w:val="000000"/>
-                <w:sz w:val="32"/>
-                <w:szCs w:val="40"/>
-              </w:rPr>
-              <w:t>–</w:t>
-            </w:r>
-            <w:proofErr w:type="spellStart"/>
-            <w:r>
-              <w:rPr>
-                <w:rFonts w:ascii="BRH Devanagari Extra" w:hAnsi="BRH Devanagari Extra" w:cs="BRH Devanagari Extra"/>
-                <w:color w:val="000000"/>
-                <w:sz w:val="40"/>
-                <w:szCs w:val="40"/>
-                <w:highlight w:val="green"/>
-              </w:rPr>
-              <w:t>SìuÉ</w:t>
-            </w:r>
-            <w:r>
-              <w:rPr>
-                <w:rFonts w:ascii="BRH Devanagari Extra" w:hAnsi="BRH Devanagari Extra" w:cs="BRH Devanagari Extra"/>
-                <w:color w:val="000000"/>
-                <w:sz w:val="40"/>
-                <w:szCs w:val="40"/>
-              </w:rPr>
-              <w:t>þiÉ</w:t>
-            </w:r>
-            <w:proofErr w:type="spellEnd"/>
-            <w:r>
-              <w:rPr>
-                <w:rFonts w:ascii="BRH Malayalam Extra" w:hAnsi="BRH Malayalam Extra" w:cs="BRH Devanagari Extra"/>
-                <w:b/>
-                <w:color w:val="000000"/>
-                <w:sz w:val="32"/>
-                <w:szCs w:val="40"/>
-              </w:rPr>
-              <w:t>–</w:t>
-            </w:r>
-            <w:r>
-              <w:rPr>
-                <w:rFonts w:ascii="BRH Devanagari Extra" w:hAnsi="BRH Devanagari Extra" w:cs="BRH Devanagari Extra"/>
-                <w:color w:val="000000"/>
-                <w:sz w:val="40"/>
-                <w:szCs w:val="40"/>
-              </w:rPr>
-              <w:t xml:space="preserve"> </w:t>
-            </w:r>
-            <w:proofErr w:type="spellStart"/>
-            <w:r>
-              <w:rPr>
-                <w:rFonts w:ascii="BRH Devanagari Extra" w:hAnsi="BRH Devanagari Extra" w:cs="BRH Devanagari Extra"/>
-                <w:color w:val="000000"/>
-                <w:sz w:val="40"/>
-                <w:szCs w:val="40"/>
-              </w:rPr>
               <w:t>CÌiÉþ</w:t>
             </w:r>
             <w:proofErr w:type="spellEnd"/>
@@ -15970,19 +15756,8 @@
                 <w:sz w:val="40"/>
                 <w:szCs w:val="40"/>
               </w:rPr>
-              <w:t xml:space="preserve"> - </w:t>
-            </w:r>
-            <w:proofErr w:type="spellStart"/>
-            <w:r>
-              <w:rPr>
-                <w:rFonts w:ascii="BRH Devanagari Extra" w:hAnsi="BRH Devanagari Extra" w:cs="BRH Devanagari Extra"/>
-                <w:color w:val="000000"/>
-                <w:sz w:val="40"/>
-                <w:szCs w:val="40"/>
-              </w:rPr>
-              <w:t>uÉ</w:t>
-            </w:r>
-            <w:proofErr w:type="spellEnd"/>
+              <w:t xml:space="preserve"> - uÉ</w:t>
+            </w:r>
             <w:r>
               <w:rPr>
                 <w:rFonts w:ascii="BRH Malayalam Extra" w:hAnsi="BRH Malayalam Extra" w:cs="BRH Devanagari Extra"/>
@@ -16061,6 +15836,7 @@
                 <w:sz w:val="28"/>
                 <w:szCs w:val="28"/>
               </w:rPr>
+              <w:lastRenderedPageBreak/>
               <w:t>TS 2.2.1</w:t>
             </w:r>
             <w:r>
@@ -16549,27 +16325,7 @@
                 <w:sz w:val="40"/>
                 <w:szCs w:val="40"/>
               </w:rPr>
-              <w:t xml:space="preserve"> </w:t>
-            </w:r>
-            <w:proofErr w:type="spellStart"/>
-            <w:r>
-              <w:rPr>
-                <w:rFonts w:ascii="BRH Devanagari Extra" w:hAnsi="BRH Devanagari Extra" w:cs="BRH Devanagari Extra"/>
-                <w:color w:val="000000"/>
-                <w:sz w:val="40"/>
-                <w:szCs w:val="40"/>
-              </w:rPr>
-              <w:t>aÉ</w:t>
-            </w:r>
-            <w:proofErr w:type="spellEnd"/>
-            <w:r>
-              <w:rPr>
-                <w:rFonts w:ascii="BRH Devanagari Extra" w:hAnsi="BRH Devanagari Extra" w:cs="BRH Devanagari Extra"/>
-                <w:color w:val="000000"/>
-                <w:sz w:val="40"/>
-                <w:szCs w:val="40"/>
-              </w:rPr>
-              <w:t>×</w:t>
+              <w:t xml:space="preserve"> aÉ×</w:t>
             </w:r>
             <w:r>
               <w:rPr>
@@ -16630,27 +16386,7 @@
                 <w:sz w:val="40"/>
                 <w:szCs w:val="40"/>
               </w:rPr>
-              <w:t xml:space="preserve"> | </w:t>
-            </w:r>
-            <w:proofErr w:type="spellStart"/>
-            <w:r>
-              <w:rPr>
-                <w:rFonts w:ascii="BRH Devanagari Extra" w:hAnsi="BRH Devanagari Extra" w:cs="BRH Devanagari Extra"/>
-                <w:color w:val="000000"/>
-                <w:sz w:val="40"/>
-                <w:szCs w:val="40"/>
-              </w:rPr>
-              <w:t>aÉ</w:t>
-            </w:r>
-            <w:proofErr w:type="spellEnd"/>
-            <w:r>
-              <w:rPr>
-                <w:rFonts w:ascii="BRH Devanagari Extra" w:hAnsi="BRH Devanagari Extra" w:cs="BRH Devanagari Extra"/>
-                <w:color w:val="000000"/>
-                <w:sz w:val="40"/>
-                <w:szCs w:val="40"/>
-              </w:rPr>
-              <w:t>×</w:t>
+              <w:t xml:space="preserve"> | aÉ×</w:t>
             </w:r>
             <w:r>
               <w:rPr>
@@ -16722,19 +16458,8 @@
                 <w:sz w:val="40"/>
                 <w:szCs w:val="40"/>
               </w:rPr>
-              <w:t xml:space="preserve"> </w:t>
-            </w:r>
-            <w:proofErr w:type="spellStart"/>
-            <w:r>
-              <w:rPr>
-                <w:rFonts w:ascii="BRH Devanagari Extra" w:hAnsi="BRH Devanagari Extra" w:cs="BRH Devanagari Extra"/>
-                <w:color w:val="000000"/>
-                <w:sz w:val="40"/>
-                <w:szCs w:val="40"/>
-              </w:rPr>
-              <w:t>iÉ</w:t>
-            </w:r>
-            <w:proofErr w:type="spellEnd"/>
+              <w:t xml:space="preserve"> iÉ</w:t>
+            </w:r>
             <w:r>
               <w:rPr>
                 <w:rFonts w:ascii="BRH Malayalam Extra" w:hAnsi="BRH Malayalam Extra" w:cs="BRH Devanagari Extra"/>
@@ -16816,19 +16541,79 @@
                 <w:sz w:val="40"/>
                 <w:szCs w:val="40"/>
               </w:rPr>
-              <w:t xml:space="preserve"> </w:t>
-            </w:r>
-            <w:proofErr w:type="spellStart"/>
-            <w:r>
-              <w:rPr>
-                <w:rFonts w:ascii="BRH Devanagari Extra" w:hAnsi="BRH Devanagari Extra" w:cs="BRH Devanagari Extra"/>
-                <w:color w:val="000000"/>
-                <w:sz w:val="40"/>
-                <w:szCs w:val="40"/>
-              </w:rPr>
-              <w:t>aÉ</w:t>
-            </w:r>
-            <w:proofErr w:type="spellEnd"/>
+              <w:t xml:space="preserve"> aÉ×</w:t>
+            </w:r>
+            <w:r>
+              <w:rPr>
+                <w:rFonts w:ascii="BRH Malayalam Extra" w:hAnsi="BRH Malayalam Extra" w:cs="BRH Devanagari Extra"/>
+                <w:b/>
+                <w:color w:val="000000"/>
+                <w:sz w:val="32"/>
+                <w:szCs w:val="40"/>
+              </w:rPr>
+              <w:t>–</w:t>
+            </w:r>
+            <w:proofErr w:type="spellStart"/>
+            <w:r>
+              <w:rPr>
+                <w:rFonts w:ascii="BRH Devanagari Extra" w:hAnsi="BRH Devanagari Extra" w:cs="BRH Devanagari Extra"/>
+                <w:color w:val="000000"/>
+                <w:sz w:val="40"/>
+                <w:szCs w:val="40"/>
+              </w:rPr>
+              <w:t>hÉÉ</w:t>
+            </w:r>
+            <w:proofErr w:type="spellEnd"/>
+            <w:r>
+              <w:rPr>
+                <w:rFonts w:ascii="BRH Malayalam Extra" w:hAnsi="BRH Malayalam Extra" w:cs="BRH Devanagari Extra"/>
+                <w:b/>
+                <w:color w:val="000000"/>
+                <w:sz w:val="32"/>
+                <w:szCs w:val="40"/>
+              </w:rPr>
+              <w:t>–</w:t>
+            </w:r>
+            <w:proofErr w:type="spellStart"/>
+            <w:r>
+              <w:rPr>
+                <w:rFonts w:ascii="BRH Devanagari Extra" w:hAnsi="BRH Devanagari Extra" w:cs="BRH Devanagari Extra"/>
+                <w:color w:val="000000"/>
+                <w:sz w:val="40"/>
+                <w:szCs w:val="40"/>
+              </w:rPr>
+              <w:t>ÍqÉ</w:t>
+            </w:r>
+            <w:proofErr w:type="spellEnd"/>
+            <w:r>
+              <w:rPr>
+                <w:rFonts w:ascii="BRH Malayalam Extra" w:hAnsi="BRH Malayalam Extra" w:cs="BRH Devanagari Extra"/>
+                <w:b/>
+                <w:color w:val="000000"/>
+                <w:sz w:val="32"/>
+                <w:szCs w:val="40"/>
+              </w:rPr>
+              <w:t>–</w:t>
+            </w:r>
+            <w:r>
+              <w:rPr>
+                <w:rFonts w:ascii="BRH Devanagari Extra" w:hAnsi="BRH Devanagari Extra" w:cs="BRH Devanagari Extra"/>
+                <w:color w:val="000000"/>
+                <w:sz w:val="40"/>
+                <w:szCs w:val="40"/>
+              </w:rPr>
+              <w:t xml:space="preserve"> | aÉ×</w:t>
+            </w:r>
+            <w:r>
+              <w:rPr>
+                <w:rFonts w:ascii="BRH Malayalam Extra" w:hAnsi="BRH Malayalam Extra" w:cs="BRH Devanagari Extra"/>
+                <w:b/>
+                <w:color w:val="000000"/>
+                <w:sz w:val="32"/>
+                <w:szCs w:val="40"/>
+              </w:rPr>
+              <w:t>–</w:t>
+            </w:r>
             <w:r>
               <w:rPr>
                 <w:rFonts w:ascii="BRH Devanagari Extra" w:hAnsi="BRH Devanagari Extra" w:cs="BRH Devanagari Extra"/>
@@ -16855,6 +16640,7 @@
                 <w:color w:val="000000"/>
                 <w:sz w:val="40"/>
                 <w:szCs w:val="40"/>
+                <w:highlight w:val="green"/>
               </w:rPr>
               <w:t>hÉÉ</w:t>
             </w:r>
@@ -16866,6 +16652,7 @@
                 <w:color w:val="000000"/>
                 <w:sz w:val="32"/>
                 <w:szCs w:val="40"/>
+                <w:highlight w:val="green"/>
               </w:rPr>
               <w:t>–</w:t>
             </w:r>
@@ -16897,121 +16684,8 @@
                 <w:sz w:val="40"/>
                 <w:szCs w:val="40"/>
               </w:rPr>
-              <w:t xml:space="preserve"> | </w:t>
-            </w:r>
-            <w:proofErr w:type="spellStart"/>
-            <w:r>
-              <w:rPr>
-                <w:rFonts w:ascii="BRH Devanagari Extra" w:hAnsi="BRH Devanagari Extra" w:cs="BRH Devanagari Extra"/>
-                <w:color w:val="000000"/>
-                <w:sz w:val="40"/>
-                <w:szCs w:val="40"/>
-              </w:rPr>
-              <w:t>aÉ</w:t>
-            </w:r>
-            <w:proofErr w:type="spellEnd"/>
-            <w:r>
-              <w:rPr>
-                <w:rFonts w:ascii="BRH Devanagari Extra" w:hAnsi="BRH Devanagari Extra" w:cs="BRH Devanagari Extra"/>
-                <w:color w:val="000000"/>
-                <w:sz w:val="40"/>
-                <w:szCs w:val="40"/>
-              </w:rPr>
-              <w:t>×</w:t>
-            </w:r>
-            <w:r>
-              <w:rPr>
-                <w:rFonts w:ascii="BRH Malayalam Extra" w:hAnsi="BRH Malayalam Extra" w:cs="BRH Devanagari Extra"/>
-                <w:b/>
-                <w:color w:val="000000"/>
-                <w:sz w:val="32"/>
-                <w:szCs w:val="40"/>
-              </w:rPr>
-              <w:t>–</w:t>
-            </w:r>
-            <w:r>
-              <w:rPr>
-                <w:rFonts w:ascii="BRH Devanagari Extra" w:hAnsi="BRH Devanagari Extra" w:cs="BRH Devanagari Extra"/>
-                <w:color w:val="000000"/>
-                <w:sz w:val="40"/>
-                <w:szCs w:val="40"/>
-              </w:rPr>
-              <w:t>×</w:t>
-            </w:r>
-            <w:r>
-              <w:rPr>
-                <w:rFonts w:ascii="BRH Malayalam Extra" w:hAnsi="BRH Malayalam Extra" w:cs="BRH Devanagari Extra"/>
-                <w:b/>
-                <w:color w:val="000000"/>
-                <w:sz w:val="32"/>
-                <w:szCs w:val="40"/>
-              </w:rPr>
-              <w:t>–</w:t>
-            </w:r>
-            <w:proofErr w:type="spellStart"/>
-            <w:r>
-              <w:rPr>
-                <w:rFonts w:ascii="BRH Devanagari Extra" w:hAnsi="BRH Devanagari Extra" w:cs="BRH Devanagari Extra"/>
-                <w:color w:val="000000"/>
-                <w:sz w:val="40"/>
-                <w:szCs w:val="40"/>
-                <w:highlight w:val="green"/>
-              </w:rPr>
-              <w:t>hÉÉ</w:t>
-            </w:r>
-            <w:proofErr w:type="spellEnd"/>
-            <w:r>
-              <w:rPr>
-                <w:rFonts w:ascii="BRH Malayalam Extra" w:hAnsi="BRH Malayalam Extra" w:cs="BRH Devanagari Extra"/>
-                <w:b/>
-                <w:color w:val="000000"/>
-                <w:sz w:val="32"/>
-                <w:szCs w:val="40"/>
-                <w:highlight w:val="green"/>
-              </w:rPr>
-              <w:t>–</w:t>
-            </w:r>
-            <w:proofErr w:type="spellStart"/>
-            <w:r>
-              <w:rPr>
-                <w:rFonts w:ascii="BRH Devanagari Extra" w:hAnsi="BRH Devanagari Extra" w:cs="BRH Devanagari Extra"/>
-                <w:color w:val="000000"/>
-                <w:sz w:val="40"/>
-                <w:szCs w:val="40"/>
-              </w:rPr>
-              <w:t>ÍqÉ</w:t>
-            </w:r>
-            <w:proofErr w:type="spellEnd"/>
-            <w:r>
-              <w:rPr>
-                <w:rFonts w:ascii="BRH Malayalam Extra" w:hAnsi="BRH Malayalam Extra" w:cs="BRH Devanagari Extra"/>
-                <w:b/>
-                <w:color w:val="000000"/>
-                <w:sz w:val="32"/>
-                <w:szCs w:val="40"/>
-              </w:rPr>
-              <w:t>–</w:t>
-            </w:r>
-            <w:r>
-              <w:rPr>
-                <w:rFonts w:ascii="BRH Devanagari Extra" w:hAnsi="BRH Devanagari Extra" w:cs="BRH Devanagari Extra"/>
-                <w:color w:val="000000"/>
-                <w:sz w:val="40"/>
-                <w:szCs w:val="40"/>
-              </w:rPr>
-              <w:t xml:space="preserve"> </w:t>
-            </w:r>
-            <w:proofErr w:type="spellStart"/>
-            <w:r>
-              <w:rPr>
-                <w:rFonts w:ascii="BRH Devanagari Extra" w:hAnsi="BRH Devanagari Extra" w:cs="BRH Devanagari Extra"/>
-                <w:color w:val="000000"/>
-                <w:sz w:val="40"/>
-                <w:szCs w:val="40"/>
-              </w:rPr>
-              <w:t>iÉ</w:t>
-            </w:r>
-            <w:proofErr w:type="spellEnd"/>
+              <w:t xml:space="preserve"> iÉ</w:t>
+            </w:r>
             <w:r>
               <w:rPr>
                 <w:rFonts w:ascii="BRH Malayalam Extra" w:hAnsi="BRH Malayalam Extra" w:cs="BRH Devanagari Extra"/>
@@ -17080,7 +16754,6 @@
                 <w:sz w:val="28"/>
                 <w:szCs w:val="28"/>
               </w:rPr>
-              <w:lastRenderedPageBreak/>
               <w:t>TS 2.2.12.7</w:t>
             </w:r>
           </w:p>
@@ -17176,19 +16849,8 @@
                 <w:sz w:val="40"/>
                 <w:szCs w:val="40"/>
               </w:rPr>
-              <w:t xml:space="preserve"> </w:t>
-            </w:r>
-            <w:proofErr w:type="spellStart"/>
-            <w:r>
-              <w:rPr>
-                <w:rFonts w:ascii="BRH Devanagari Extra" w:hAnsi="BRH Devanagari Extra" w:cs="BRH Devanagari Extra"/>
-                <w:color w:val="000000"/>
-                <w:sz w:val="40"/>
-                <w:szCs w:val="40"/>
-              </w:rPr>
-              <w:t>zÉ</w:t>
-            </w:r>
-            <w:proofErr w:type="spellEnd"/>
+              <w:t xml:space="preserve"> zÉ</w:t>
+            </w:r>
             <w:r>
               <w:rPr>
                 <w:rFonts w:ascii="BRH Malayalam Extra" w:hAnsi="BRH Malayalam Extra" w:cs="BRH Devanagari Extra"/>
@@ -17340,19 +17002,8 @@
                 <w:sz w:val="40"/>
                 <w:szCs w:val="40"/>
               </w:rPr>
-              <w:t xml:space="preserve"> </w:t>
-            </w:r>
-            <w:proofErr w:type="spellStart"/>
-            <w:r>
-              <w:rPr>
-                <w:rFonts w:ascii="BRH Devanagari Extra" w:hAnsi="BRH Devanagari Extra" w:cs="BRH Devanagari Extra"/>
-                <w:color w:val="000000"/>
-                <w:sz w:val="40"/>
-                <w:szCs w:val="40"/>
-              </w:rPr>
-              <w:t>zÉ</w:t>
-            </w:r>
-            <w:proofErr w:type="spellEnd"/>
+              <w:t xml:space="preserve"> zÉ</w:t>
+            </w:r>
             <w:r>
               <w:rPr>
                 <w:rFonts w:ascii="BRH Malayalam Extra" w:hAnsi="BRH Malayalam Extra" w:cs="BRH Devanagari Extra"/>
@@ -17858,6 +17509,7 @@
                 <w:sz w:val="28"/>
                 <w:szCs w:val="28"/>
               </w:rPr>
+              <w:lastRenderedPageBreak/>
               <w:t>None</w:t>
             </w:r>
           </w:p>
@@ -17987,7 +17639,7 @@
 </file>
 
 <file path=word/endnotes.xml><?xml version="1.0" encoding="utf-8"?>
-<w:endnotes xmlns:wpc="http://schemas.microsoft.com/office/word/2010/wordprocessingCanvas" xmlns:cx="http://schemas.microsoft.com/office/drawing/2014/chartex" xmlns:cx1="http://schemas.microsoft.com/office/drawing/2015/9/8/chartex" xmlns:mc="http://schemas.openxmlformats.org/markup-compatibility/2006" xmlns:o="urn:schemas-microsoft-com:office:office" xmlns:r="http://schemas.openxmlformats.org/officeDocument/2006/relationships" xmlns:m="http://schemas.openxmlformats.org/officeDocument/2006/math" xmlns:v="urn:schemas-microsoft-com:vml" xmlns:wp14="http://schemas.microsoft.com/office/word/2010/wordprocessingDrawing" xmlns:wp="http://schemas.openxmlformats.org/drawingml/2006/wordprocessingDrawing" xmlns:w10="urn:schemas-microsoft-com:office:word" xmlns:w="http://schemas.openxmlformats.org/wordprocessingml/2006/main" xmlns:w14="http://schemas.microsoft.com/office/word/2010/wordml" xmlns:w15="http://schemas.microsoft.com/office/word/2012/wordml" xmlns:w16se="http://schemas.microsoft.com/office/word/2015/wordml/symex" xmlns:wpg="http://schemas.microsoft.com/office/word/2010/wordprocessingGroup" xmlns:wpi="http://schemas.microsoft.com/office/word/2010/wordprocessingInk" xmlns:wne="http://schemas.microsoft.com/office/word/2006/wordml" xmlns:wps="http://schemas.microsoft.com/office/word/2010/wordprocessingShape" mc:Ignorable="w14 w15 w16se wp14">
+<w:endnotes xmlns:wpc="http://schemas.microsoft.com/office/word/2010/wordprocessingCanvas" xmlns:cx="http://schemas.microsoft.com/office/drawing/2014/chartex" xmlns:cx1="http://schemas.microsoft.com/office/drawing/2015/9/8/chartex" xmlns:cx2="http://schemas.microsoft.com/office/drawing/2015/10/21/chartex" xmlns:cx3="http://schemas.microsoft.com/office/drawing/2016/5/9/chartex" xmlns:cx4="http://schemas.microsoft.com/office/drawing/2016/5/10/chartex" xmlns:cx5="http://schemas.microsoft.com/office/drawing/2016/5/11/chartex" xmlns:cx6="http://schemas.microsoft.com/office/drawing/2016/5/12/chartex" xmlns:cx7="http://schemas.microsoft.com/office/drawing/2016/5/13/chartex" xmlns:cx8="http://schemas.microsoft.com/office/drawing/2016/5/14/chartex" xmlns:mc="http://schemas.openxmlformats.org/markup-compatibility/2006" xmlns:aink="http://schemas.microsoft.com/office/drawing/2016/ink" xmlns:am3d="http://schemas.microsoft.com/office/drawing/2017/model3d" xmlns:o="urn:schemas-microsoft-com:office:office" xmlns:oel="http://schemas.microsoft.com/office/2019/extlst" xmlns:r="http://schemas.openxmlformats.org/officeDocument/2006/relationships" xmlns:m="http://schemas.openxmlformats.org/officeDocument/2006/math" xmlns:v="urn:schemas-microsoft-com:vml" xmlns:wp14="http://schemas.microsoft.com/office/word/2010/wordprocessingDrawing" xmlns:wp="http://schemas.openxmlformats.org/drawingml/2006/wordprocessingDrawing" xmlns:w10="urn:schemas-microsoft-com:office:word" xmlns:w="http://schemas.openxmlformats.org/wordprocessingml/2006/main" xmlns:w14="http://schemas.microsoft.com/office/word/2010/wordml" xmlns:w15="http://schemas.microsoft.com/office/word/2012/wordml" xmlns:w16cex="http://schemas.microsoft.com/office/word/2018/wordml/cex" xmlns:w16cid="http://schemas.microsoft.com/office/word/2016/wordml/cid" xmlns:w16="http://schemas.microsoft.com/office/word/2018/wordml" xmlns:w16du="http://schemas.microsoft.com/office/word/2023/wordml/word16du" xmlns:w16sdtdh="http://schemas.microsoft.com/office/word/2020/wordml/sdtdatahash" xmlns:w16sdtfl="http://schemas.microsoft.com/office/word/2024/wordml/sdtformatlock" xmlns:w16se="http://schemas.microsoft.com/office/word/2015/wordml/symex" xmlns:wpg="http://schemas.microsoft.com/office/word/2010/wordprocessingGroup" xmlns:wpi="http://schemas.microsoft.com/office/word/2010/wordprocessingInk" xmlns:wne="http://schemas.microsoft.com/office/word/2006/wordml" xmlns:wps="http://schemas.microsoft.com/office/word/2010/wordprocessingShape" mc:Ignorable="w14 w15 w16se w16cid w16 w16cex w16sdtdh w16sdtfl w16du wp14">
   <w:endnote w:type="separator" w:id="-1">
     <w:p>
       <w:pPr>
@@ -18012,7 +17664,7 @@
 </file>
 
 <file path=word/footer1.xml><?xml version="1.0" encoding="utf-8"?>
-<w:ftr xmlns:wpc="http://schemas.microsoft.com/office/word/2010/wordprocessingCanvas" xmlns:cx="http://schemas.microsoft.com/office/drawing/2014/chartex" xmlns:cx1="http://schemas.microsoft.com/office/drawing/2015/9/8/chartex" xmlns:mc="http://schemas.openxmlformats.org/markup-compatibility/2006" xmlns:o="urn:schemas-microsoft-com:office:office" xmlns:r="http://schemas.openxmlformats.org/officeDocument/2006/relationships" xmlns:m="http://schemas.openxmlformats.org/officeDocument/2006/math" xmlns:v="urn:schemas-microsoft-com:vml" xmlns:wp14="http://schemas.microsoft.com/office/word/2010/wordprocessingDrawing" xmlns:wp="http://schemas.openxmlformats.org/drawingml/2006/wordprocessingDrawing" xmlns:w10="urn:schemas-microsoft-com:office:word" xmlns:w="http://schemas.openxmlformats.org/wordprocessingml/2006/main" xmlns:w14="http://schemas.microsoft.com/office/word/2010/wordml" xmlns:w15="http://schemas.microsoft.com/office/word/2012/wordml" xmlns:w16se="http://schemas.microsoft.com/office/word/2015/wordml/symex" xmlns:wpg="http://schemas.microsoft.com/office/word/2010/wordprocessingGroup" xmlns:wpi="http://schemas.microsoft.com/office/word/2010/wordprocessingInk" xmlns:wne="http://schemas.microsoft.com/office/word/2006/wordml" xmlns:wps="http://schemas.microsoft.com/office/word/2010/wordprocessingShape" mc:Ignorable="w14 w15 w16se wp14">
+<w:ftr xmlns:wpc="http://schemas.microsoft.com/office/word/2010/wordprocessingCanvas" xmlns:cx="http://schemas.microsoft.com/office/drawing/2014/chartex" xmlns:cx1="http://schemas.microsoft.com/office/drawing/2015/9/8/chartex" xmlns:cx2="http://schemas.microsoft.com/office/drawing/2015/10/21/chartex" xmlns:cx3="http://schemas.microsoft.com/office/drawing/2016/5/9/chartex" xmlns:cx4="http://schemas.microsoft.com/office/drawing/2016/5/10/chartex" xmlns:cx5="http://schemas.microsoft.com/office/drawing/2016/5/11/chartex" xmlns:cx6="http://schemas.microsoft.com/office/drawing/2016/5/12/chartex" xmlns:cx7="http://schemas.microsoft.com/office/drawing/2016/5/13/chartex" xmlns:cx8="http://schemas.microsoft.com/office/drawing/2016/5/14/chartex" xmlns:mc="http://schemas.openxmlformats.org/markup-compatibility/2006" xmlns:aink="http://schemas.microsoft.com/office/drawing/2016/ink" xmlns:am3d="http://schemas.microsoft.com/office/drawing/2017/model3d" xmlns:o="urn:schemas-microsoft-com:office:office" xmlns:oel="http://schemas.microsoft.com/office/2019/extlst" xmlns:r="http://schemas.openxmlformats.org/officeDocument/2006/relationships" xmlns:m="http://schemas.openxmlformats.org/officeDocument/2006/math" xmlns:v="urn:schemas-microsoft-com:vml" xmlns:wp14="http://schemas.microsoft.com/office/word/2010/wordprocessingDrawing" xmlns:wp="http://schemas.openxmlformats.org/drawingml/2006/wordprocessingDrawing" xmlns:w10="urn:schemas-microsoft-com:office:word" xmlns:w="http://schemas.openxmlformats.org/wordprocessingml/2006/main" xmlns:w14="http://schemas.microsoft.com/office/word/2010/wordml" xmlns:w15="http://schemas.microsoft.com/office/word/2012/wordml" xmlns:w16cex="http://schemas.microsoft.com/office/word/2018/wordml/cex" xmlns:w16cid="http://schemas.microsoft.com/office/word/2016/wordml/cid" xmlns:w16="http://schemas.microsoft.com/office/word/2018/wordml" xmlns:w16du="http://schemas.microsoft.com/office/word/2023/wordml/word16du" xmlns:w16sdtdh="http://schemas.microsoft.com/office/word/2020/wordml/sdtdatahash" xmlns:w16sdtfl="http://schemas.microsoft.com/office/word/2024/wordml/sdtformatlock" xmlns:w16se="http://schemas.microsoft.com/office/word/2015/wordml/symex" xmlns:wpg="http://schemas.microsoft.com/office/word/2010/wordprocessingGroup" xmlns:wpi="http://schemas.microsoft.com/office/word/2010/wordprocessingInk" xmlns:wne="http://schemas.microsoft.com/office/word/2006/wordml" xmlns:wps="http://schemas.microsoft.com/office/word/2010/wordprocessingShape" mc:Ignorable="w14 w15 w16se w16cid w16 w16cex w16sdtdh w16sdtfl w16du wp14">
   <w:p>
     <w:pPr>
       <w:pStyle w:val="Footer"/>
@@ -18159,7 +17811,7 @@
 </file>
 
 <file path=word/footer2.xml><?xml version="1.0" encoding="utf-8"?>
-<w:ftr xmlns:wpc="http://schemas.microsoft.com/office/word/2010/wordprocessingCanvas" xmlns:cx="http://schemas.microsoft.com/office/drawing/2014/chartex" xmlns:cx1="http://schemas.microsoft.com/office/drawing/2015/9/8/chartex" xmlns:mc="http://schemas.openxmlformats.org/markup-compatibility/2006" xmlns:o="urn:schemas-microsoft-com:office:office" xmlns:r="http://schemas.openxmlformats.org/officeDocument/2006/relationships" xmlns:m="http://schemas.openxmlformats.org/officeDocument/2006/math" xmlns:v="urn:schemas-microsoft-com:vml" xmlns:wp14="http://schemas.microsoft.com/office/word/2010/wordprocessingDrawing" xmlns:wp="http://schemas.openxmlformats.org/drawingml/2006/wordprocessingDrawing" xmlns:w10="urn:schemas-microsoft-com:office:word" xmlns:w="http://schemas.openxmlformats.org/wordprocessingml/2006/main" xmlns:w14="http://schemas.microsoft.com/office/word/2010/wordml" xmlns:w15="http://schemas.microsoft.com/office/word/2012/wordml" xmlns:w16se="http://schemas.microsoft.com/office/word/2015/wordml/symex" xmlns:wpg="http://schemas.microsoft.com/office/word/2010/wordprocessingGroup" xmlns:wpi="http://schemas.microsoft.com/office/word/2010/wordprocessingInk" xmlns:wne="http://schemas.microsoft.com/office/word/2006/wordml" xmlns:wps="http://schemas.microsoft.com/office/word/2010/wordprocessingShape" mc:Ignorable="w14 w15 w16se wp14">
+<w:ftr xmlns:wpc="http://schemas.microsoft.com/office/word/2010/wordprocessingCanvas" xmlns:cx="http://schemas.microsoft.com/office/drawing/2014/chartex" xmlns:cx1="http://schemas.microsoft.com/office/drawing/2015/9/8/chartex" xmlns:cx2="http://schemas.microsoft.com/office/drawing/2015/10/21/chartex" xmlns:cx3="http://schemas.microsoft.com/office/drawing/2016/5/9/chartex" xmlns:cx4="http://schemas.microsoft.com/office/drawing/2016/5/10/chartex" xmlns:cx5="http://schemas.microsoft.com/office/drawing/2016/5/11/chartex" xmlns:cx6="http://schemas.microsoft.com/office/drawing/2016/5/12/chartex" xmlns:cx7="http://schemas.microsoft.com/office/drawing/2016/5/13/chartex" xmlns:cx8="http://schemas.microsoft.com/office/drawing/2016/5/14/chartex" xmlns:mc="http://schemas.openxmlformats.org/markup-compatibility/2006" xmlns:aink="http://schemas.microsoft.com/office/drawing/2016/ink" xmlns:am3d="http://schemas.microsoft.com/office/drawing/2017/model3d" xmlns:o="urn:schemas-microsoft-com:office:office" xmlns:oel="http://schemas.microsoft.com/office/2019/extlst" xmlns:r="http://schemas.openxmlformats.org/officeDocument/2006/relationships" xmlns:m="http://schemas.openxmlformats.org/officeDocument/2006/math" xmlns:v="urn:schemas-microsoft-com:vml" xmlns:wp14="http://schemas.microsoft.com/office/word/2010/wordprocessingDrawing" xmlns:wp="http://schemas.openxmlformats.org/drawingml/2006/wordprocessingDrawing" xmlns:w10="urn:schemas-microsoft-com:office:word" xmlns:w="http://schemas.openxmlformats.org/wordprocessingml/2006/main" xmlns:w14="http://schemas.microsoft.com/office/word/2010/wordml" xmlns:w15="http://schemas.microsoft.com/office/word/2012/wordml" xmlns:w16cex="http://schemas.microsoft.com/office/word/2018/wordml/cex" xmlns:w16cid="http://schemas.microsoft.com/office/word/2016/wordml/cid" xmlns:w16="http://schemas.microsoft.com/office/word/2018/wordml" xmlns:w16du="http://schemas.microsoft.com/office/word/2023/wordml/word16du" xmlns:w16sdtdh="http://schemas.microsoft.com/office/word/2020/wordml/sdtdatahash" xmlns:w16sdtfl="http://schemas.microsoft.com/office/word/2024/wordml/sdtformatlock" xmlns:w16se="http://schemas.microsoft.com/office/word/2015/wordml/symex" xmlns:wpg="http://schemas.microsoft.com/office/word/2010/wordprocessingGroup" xmlns:wpi="http://schemas.microsoft.com/office/word/2010/wordprocessingInk" xmlns:wne="http://schemas.microsoft.com/office/word/2006/wordml" xmlns:wps="http://schemas.microsoft.com/office/word/2010/wordprocessingShape" mc:Ignorable="w14 w15 w16se w16cid w16 w16cex w16sdtdh w16sdtfl w16du wp14">
   <w:p>
     <w:pPr>
       <w:pBdr>
@@ -18362,7 +18014,7 @@
 </file>
 
 <file path=word/footnotes.xml><?xml version="1.0" encoding="utf-8"?>
-<w:footnotes xmlns:wpc="http://schemas.microsoft.com/office/word/2010/wordprocessingCanvas" xmlns:cx="http://schemas.microsoft.com/office/drawing/2014/chartex" xmlns:cx1="http://schemas.microsoft.com/office/drawing/2015/9/8/chartex" xmlns:mc="http://schemas.openxmlformats.org/markup-compatibility/2006" xmlns:o="urn:schemas-microsoft-com:office:office" xmlns:r="http://schemas.openxmlformats.org/officeDocument/2006/relationships" xmlns:m="http://schemas.openxmlformats.org/officeDocument/2006/math" xmlns:v="urn:schemas-microsoft-com:vml" xmlns:wp14="http://schemas.microsoft.com/office/word/2010/wordprocessingDrawing" xmlns:wp="http://schemas.openxmlformats.org/drawingml/2006/wordprocessingDrawing" xmlns:w10="urn:schemas-microsoft-com:office:word" xmlns:w="http://schemas.openxmlformats.org/wordprocessingml/2006/main" xmlns:w14="http://schemas.microsoft.com/office/word/2010/wordml" xmlns:w15="http://schemas.microsoft.com/office/word/2012/wordml" xmlns:w16se="http://schemas.microsoft.com/office/word/2015/wordml/symex" xmlns:wpg="http://schemas.microsoft.com/office/word/2010/wordprocessingGroup" xmlns:wpi="http://schemas.microsoft.com/office/word/2010/wordprocessingInk" xmlns:wne="http://schemas.microsoft.com/office/word/2006/wordml" xmlns:wps="http://schemas.microsoft.com/office/word/2010/wordprocessingShape" mc:Ignorable="w14 w15 w16se wp14">
+<w:footnotes xmlns:wpc="http://schemas.microsoft.com/office/word/2010/wordprocessingCanvas" xmlns:cx="http://schemas.microsoft.com/office/drawing/2014/chartex" xmlns:cx1="http://schemas.microsoft.com/office/drawing/2015/9/8/chartex" xmlns:cx2="http://schemas.microsoft.com/office/drawing/2015/10/21/chartex" xmlns:cx3="http://schemas.microsoft.com/office/drawing/2016/5/9/chartex" xmlns:cx4="http://schemas.microsoft.com/office/drawing/2016/5/10/chartex" xmlns:cx5="http://schemas.microsoft.com/office/drawing/2016/5/11/chartex" xmlns:cx6="http://schemas.microsoft.com/office/drawing/2016/5/12/chartex" xmlns:cx7="http://schemas.microsoft.com/office/drawing/2016/5/13/chartex" xmlns:cx8="http://schemas.microsoft.com/office/drawing/2016/5/14/chartex" xmlns:mc="http://schemas.openxmlformats.org/markup-compatibility/2006" xmlns:aink="http://schemas.microsoft.com/office/drawing/2016/ink" xmlns:am3d="http://schemas.microsoft.com/office/drawing/2017/model3d" xmlns:o="urn:schemas-microsoft-com:office:office" xmlns:oel="http://schemas.microsoft.com/office/2019/extlst" xmlns:r="http://schemas.openxmlformats.org/officeDocument/2006/relationships" xmlns:m="http://schemas.openxmlformats.org/officeDocument/2006/math" xmlns:v="urn:schemas-microsoft-com:vml" xmlns:wp14="http://schemas.microsoft.com/office/word/2010/wordprocessingDrawing" xmlns:wp="http://schemas.openxmlformats.org/drawingml/2006/wordprocessingDrawing" xmlns:w10="urn:schemas-microsoft-com:office:word" xmlns:w="http://schemas.openxmlformats.org/wordprocessingml/2006/main" xmlns:w14="http://schemas.microsoft.com/office/word/2010/wordml" xmlns:w15="http://schemas.microsoft.com/office/word/2012/wordml" xmlns:w16cex="http://schemas.microsoft.com/office/word/2018/wordml/cex" xmlns:w16cid="http://schemas.microsoft.com/office/word/2016/wordml/cid" xmlns:w16="http://schemas.microsoft.com/office/word/2018/wordml" xmlns:w16du="http://schemas.microsoft.com/office/word/2023/wordml/word16du" xmlns:w16sdtdh="http://schemas.microsoft.com/office/word/2020/wordml/sdtdatahash" xmlns:w16sdtfl="http://schemas.microsoft.com/office/word/2024/wordml/sdtformatlock" xmlns:w16se="http://schemas.microsoft.com/office/word/2015/wordml/symex" xmlns:wpg="http://schemas.microsoft.com/office/word/2010/wordprocessingGroup" xmlns:wpi="http://schemas.microsoft.com/office/word/2010/wordprocessingInk" xmlns:wne="http://schemas.microsoft.com/office/word/2006/wordml" xmlns:wps="http://schemas.microsoft.com/office/word/2010/wordprocessingShape" mc:Ignorable="w14 w15 w16se w16cid w16 w16cex w16sdtdh w16sdtfl w16du wp14">
   <w:footnote w:type="separator" w:id="-1">
     <w:p>
       <w:pPr>
@@ -18387,7 +18039,7 @@
 </file>
 
 <file path=word/header1.xml><?xml version="1.0" encoding="utf-8"?>
-<w:hdr xmlns:wpc="http://schemas.microsoft.com/office/word/2010/wordprocessingCanvas" xmlns:cx="http://schemas.microsoft.com/office/drawing/2014/chartex" xmlns:cx1="http://schemas.microsoft.com/office/drawing/2015/9/8/chartex" xmlns:mc="http://schemas.openxmlformats.org/markup-compatibility/2006" xmlns:o="urn:schemas-microsoft-com:office:office" xmlns:r="http://schemas.openxmlformats.org/officeDocument/2006/relationships" xmlns:m="http://schemas.openxmlformats.org/officeDocument/2006/math" xmlns:v="urn:schemas-microsoft-com:vml" xmlns:wp14="http://schemas.microsoft.com/office/word/2010/wordprocessingDrawing" xmlns:wp="http://schemas.openxmlformats.org/drawingml/2006/wordprocessingDrawing" xmlns:w10="urn:schemas-microsoft-com:office:word" xmlns:w="http://schemas.openxmlformats.org/wordprocessingml/2006/main" xmlns:w14="http://schemas.microsoft.com/office/word/2010/wordml" xmlns:w15="http://schemas.microsoft.com/office/word/2012/wordml" xmlns:w16se="http://schemas.microsoft.com/office/word/2015/wordml/symex" xmlns:wpg="http://schemas.microsoft.com/office/word/2010/wordprocessingGroup" xmlns:wpi="http://schemas.microsoft.com/office/word/2010/wordprocessingInk" xmlns:wne="http://schemas.microsoft.com/office/word/2006/wordml" xmlns:wps="http://schemas.microsoft.com/office/word/2010/wordprocessingShape" mc:Ignorable="w14 w15 w16se wp14">
+<w:hdr xmlns:wpc="http://schemas.microsoft.com/office/word/2010/wordprocessingCanvas" xmlns:cx="http://schemas.microsoft.com/office/drawing/2014/chartex" xmlns:cx1="http://schemas.microsoft.com/office/drawing/2015/9/8/chartex" xmlns:cx2="http://schemas.microsoft.com/office/drawing/2015/10/21/chartex" xmlns:cx3="http://schemas.microsoft.com/office/drawing/2016/5/9/chartex" xmlns:cx4="http://schemas.microsoft.com/office/drawing/2016/5/10/chartex" xmlns:cx5="http://schemas.microsoft.com/office/drawing/2016/5/11/chartex" xmlns:cx6="http://schemas.microsoft.com/office/drawing/2016/5/12/chartex" xmlns:cx7="http://schemas.microsoft.com/office/drawing/2016/5/13/chartex" xmlns:cx8="http://schemas.microsoft.com/office/drawing/2016/5/14/chartex" xmlns:mc="http://schemas.openxmlformats.org/markup-compatibility/2006" xmlns:aink="http://schemas.microsoft.com/office/drawing/2016/ink" xmlns:am3d="http://schemas.microsoft.com/office/drawing/2017/model3d" xmlns:o="urn:schemas-microsoft-com:office:office" xmlns:oel="http://schemas.microsoft.com/office/2019/extlst" xmlns:r="http://schemas.openxmlformats.org/officeDocument/2006/relationships" xmlns:m="http://schemas.openxmlformats.org/officeDocument/2006/math" xmlns:v="urn:schemas-microsoft-com:vml" xmlns:wp14="http://schemas.microsoft.com/office/word/2010/wordprocessingDrawing" xmlns:wp="http://schemas.openxmlformats.org/drawingml/2006/wordprocessingDrawing" xmlns:w10="urn:schemas-microsoft-com:office:word" xmlns:w="http://schemas.openxmlformats.org/wordprocessingml/2006/main" xmlns:w14="http://schemas.microsoft.com/office/word/2010/wordml" xmlns:w15="http://schemas.microsoft.com/office/word/2012/wordml" xmlns:w16cex="http://schemas.microsoft.com/office/word/2018/wordml/cex" xmlns:w16cid="http://schemas.microsoft.com/office/word/2016/wordml/cid" xmlns:w16="http://schemas.microsoft.com/office/word/2018/wordml" xmlns:w16du="http://schemas.microsoft.com/office/word/2023/wordml/word16du" xmlns:w16sdtdh="http://schemas.microsoft.com/office/word/2020/wordml/sdtdatahash" xmlns:w16sdtfl="http://schemas.microsoft.com/office/word/2024/wordml/sdtformatlock" xmlns:w16se="http://schemas.microsoft.com/office/word/2015/wordml/symex" xmlns:wpg="http://schemas.microsoft.com/office/word/2010/wordprocessingGroup" xmlns:wpi="http://schemas.microsoft.com/office/word/2010/wordprocessingInk" xmlns:wne="http://schemas.microsoft.com/office/word/2006/wordml" xmlns:wps="http://schemas.microsoft.com/office/word/2010/wordprocessingShape" mc:Ignorable="w14 w15 w16se w16cid w16 w16cex w16sdtdh w16sdtfl w16du wp14">
   <w:p>
     <w:pPr>
       <w:pStyle w:val="Header"/>
@@ -18400,7 +18052,7 @@
 </file>
 
 <file path=word/header2.xml><?xml version="1.0" encoding="utf-8"?>
-<w:hdr xmlns:wpc="http://schemas.microsoft.com/office/word/2010/wordprocessingCanvas" xmlns:cx="http://schemas.microsoft.com/office/drawing/2014/chartex" xmlns:cx1="http://schemas.microsoft.com/office/drawing/2015/9/8/chartex" xmlns:mc="http://schemas.openxmlformats.org/markup-compatibility/2006" xmlns:o="urn:schemas-microsoft-com:office:office" xmlns:r="http://schemas.openxmlformats.org/officeDocument/2006/relationships" xmlns:m="http://schemas.openxmlformats.org/officeDocument/2006/math" xmlns:v="urn:schemas-microsoft-com:vml" xmlns:wp14="http://schemas.microsoft.com/office/word/2010/wordprocessingDrawing" xmlns:wp="http://schemas.openxmlformats.org/drawingml/2006/wordprocessingDrawing" xmlns:w10="urn:schemas-microsoft-com:office:word" xmlns:w="http://schemas.openxmlformats.org/wordprocessingml/2006/main" xmlns:w14="http://schemas.microsoft.com/office/word/2010/wordml" xmlns:w15="http://schemas.microsoft.com/office/word/2012/wordml" xmlns:w16se="http://schemas.microsoft.com/office/word/2015/wordml/symex" xmlns:wpg="http://schemas.microsoft.com/office/word/2010/wordprocessingGroup" xmlns:wpi="http://schemas.microsoft.com/office/word/2010/wordprocessingInk" xmlns:wne="http://schemas.microsoft.com/office/word/2006/wordml" xmlns:wps="http://schemas.microsoft.com/office/word/2010/wordprocessingShape" mc:Ignorable="w14 w15 w16se wp14">
+<w:hdr xmlns:wpc="http://schemas.microsoft.com/office/word/2010/wordprocessingCanvas" xmlns:cx="http://schemas.microsoft.com/office/drawing/2014/chartex" xmlns:cx1="http://schemas.microsoft.com/office/drawing/2015/9/8/chartex" xmlns:cx2="http://schemas.microsoft.com/office/drawing/2015/10/21/chartex" xmlns:cx3="http://schemas.microsoft.com/office/drawing/2016/5/9/chartex" xmlns:cx4="http://schemas.microsoft.com/office/drawing/2016/5/10/chartex" xmlns:cx5="http://schemas.microsoft.com/office/drawing/2016/5/11/chartex" xmlns:cx6="http://schemas.microsoft.com/office/drawing/2016/5/12/chartex" xmlns:cx7="http://schemas.microsoft.com/office/drawing/2016/5/13/chartex" xmlns:cx8="http://schemas.microsoft.com/office/drawing/2016/5/14/chartex" xmlns:mc="http://schemas.openxmlformats.org/markup-compatibility/2006" xmlns:aink="http://schemas.microsoft.com/office/drawing/2016/ink" xmlns:am3d="http://schemas.microsoft.com/office/drawing/2017/model3d" xmlns:o="urn:schemas-microsoft-com:office:office" xmlns:oel="http://schemas.microsoft.com/office/2019/extlst" xmlns:r="http://schemas.openxmlformats.org/officeDocument/2006/relationships" xmlns:m="http://schemas.openxmlformats.org/officeDocument/2006/math" xmlns:v="urn:schemas-microsoft-com:vml" xmlns:wp14="http://schemas.microsoft.com/office/word/2010/wordprocessingDrawing" xmlns:wp="http://schemas.openxmlformats.org/drawingml/2006/wordprocessingDrawing" xmlns:w10="urn:schemas-microsoft-com:office:word" xmlns:w="http://schemas.openxmlformats.org/wordprocessingml/2006/main" xmlns:w14="http://schemas.microsoft.com/office/word/2010/wordml" xmlns:w15="http://schemas.microsoft.com/office/word/2012/wordml" xmlns:w16cex="http://schemas.microsoft.com/office/word/2018/wordml/cex" xmlns:w16cid="http://schemas.microsoft.com/office/word/2016/wordml/cid" xmlns:w16="http://schemas.microsoft.com/office/word/2018/wordml" xmlns:w16du="http://schemas.microsoft.com/office/word/2023/wordml/word16du" xmlns:w16sdtdh="http://schemas.microsoft.com/office/word/2020/wordml/sdtdatahash" xmlns:w16sdtfl="http://schemas.microsoft.com/office/word/2024/wordml/sdtformatlock" xmlns:w16se="http://schemas.microsoft.com/office/word/2015/wordml/symex" xmlns:wpg="http://schemas.microsoft.com/office/word/2010/wordprocessingGroup" xmlns:wpi="http://schemas.microsoft.com/office/word/2010/wordprocessingInk" xmlns:wne="http://schemas.microsoft.com/office/word/2006/wordml" xmlns:wps="http://schemas.microsoft.com/office/word/2010/wordprocessingShape" mc:Ignorable="w14 w15 w16se w16cid w16 w16cex w16sdtdh w16sdtfl w16du wp14">
   <w:p>
     <w:pPr>
       <w:pStyle w:val="Header"/>
@@ -18413,7 +18065,7 @@
 </file>
 
 <file path=word/styles.xml><?xml version="1.0" encoding="utf-8"?>
-<w:styles xmlns:mc="http://schemas.openxmlformats.org/markup-compatibility/2006" xmlns:r="http://schemas.openxmlformats.org/officeDocument/2006/relationships" xmlns:w="http://schemas.openxmlformats.org/wordprocessingml/2006/main" xmlns:w14="http://schemas.microsoft.com/office/word/2010/wordml" xmlns:w15="http://schemas.microsoft.com/office/word/2012/wordml" xmlns:w16se="http://schemas.microsoft.com/office/word/2015/wordml/symex" mc:Ignorable="w14 w15 w16se">
+<w:styles xmlns:mc="http://schemas.openxmlformats.org/markup-compatibility/2006" xmlns:r="http://schemas.openxmlformats.org/officeDocument/2006/relationships" xmlns:w="http://schemas.openxmlformats.org/wordprocessingml/2006/main" xmlns:w14="http://schemas.microsoft.com/office/word/2010/wordml" xmlns:w15="http://schemas.microsoft.com/office/word/2012/wordml" xmlns:w16cex="http://schemas.microsoft.com/office/word/2018/wordml/cex" xmlns:w16cid="http://schemas.microsoft.com/office/word/2016/wordml/cid" xmlns:w16="http://schemas.microsoft.com/office/word/2018/wordml" xmlns:w16du="http://schemas.microsoft.com/office/word/2023/wordml/word16du" xmlns:w16sdtdh="http://schemas.microsoft.com/office/word/2020/wordml/sdtdatahash" xmlns:w16sdtfl="http://schemas.microsoft.com/office/word/2024/wordml/sdtformatlock" xmlns:w16se="http://schemas.microsoft.com/office/word/2015/wordml/symex" mc:Ignorable="w14 w15 w16se w16cid w16 w16cex w16sdtdh w16sdtfl w16du">
   <w:docDefaults>
     <w:rPrDefault>
       <w:rPr>
@@ -18423,7 +18075,7 @@
     </w:rPrDefault>
     <w:pPrDefault/>
   </w:docDefaults>
-  <w:latentStyles w:defLockedState="0" w:defUIPriority="99" w:defSemiHidden="0" w:defUnhideWhenUsed="0" w:defQFormat="0" w:count="371">
+  <w:latentStyles w:defLockedState="0" w:defUIPriority="99" w:defSemiHidden="0" w:defUnhideWhenUsed="0" w:defQFormat="0" w:count="376">
     <w:lsdException w:name="Normal" w:uiPriority="0" w:qFormat="1"/>
     <w:lsdException w:name="heading 1" w:uiPriority="9" w:qFormat="1"/>
     <w:lsdException w:name="heading 2" w:semiHidden="1" w:uiPriority="9" w:unhideWhenUsed="1" w:qFormat="1"/>
@@ -18795,6 +18447,11 @@
     <w:lsdException w:name="List Table 5 Dark Accent 6" w:uiPriority="50"/>
     <w:lsdException w:name="List Table 6 Colorful Accent 6" w:uiPriority="51"/>
     <w:lsdException w:name="List Table 7 Colorful Accent 6" w:uiPriority="52"/>
+    <w:lsdException w:name="Mention" w:semiHidden="1" w:unhideWhenUsed="1"/>
+    <w:lsdException w:name="Smart Hyperlink" w:semiHidden="1" w:unhideWhenUsed="1"/>
+    <w:lsdException w:name="Hashtag" w:semiHidden="1" w:unhideWhenUsed="1"/>
+    <w:lsdException w:name="Unresolved Mention" w:semiHidden="1" w:unhideWhenUsed="1"/>
+    <w:lsdException w:name="Smart Link" w:semiHidden="1" w:unhideWhenUsed="1"/>
   </w:latentStyles>
   <w:style w:type="paragraph" w:default="1" w:styleId="Normal">
     <w:name w:val="Normal"/>

</xml_diff>